<commit_message>
feat(atc): consolidar reglas Sesión #2 (rutas Ocotlán/DriveIn, bloqueo estricto de precios y muestras PZA)
</commit_message>
<xml_diff>
--- a/requerimientos/atencion_al_cliente/REGLAS_DE_NEGOCIO_ATC_FORMATEX.docx
+++ b/requerimientos/atencion_al_cliente/REGLAS_DE_NEGOCIO_ATC_FORMATEX.docx
@@ -4,52 +4,41 @@
   <w:body>
     <w:p>
       <w:pPr>
-        <w:jc w:val="right"/>
+        <w:spacing w:after="40"/>
       </w:pPr>
       <w:r>
         <w:rPr>
           <w:b/>
-          <w:color w:val="6366F1"/>
-          <w:sz w:val="17"/>
+          <w:color w:val="3730A3"/>
+          <w:sz w:val="18"/>
         </w:rPr>
-        <w:t>FORMATEX WMS 360° | ESPECIFICACIÓN FUNCIONAL Y REGLAS DE NEGOCIO</w:t>
-        <w:br/>
-      </w:r>
-      <w:r>
-        <w:rPr>
-          <w:color w:val="6B7280"/>
-          <w:sz w:val="16"/>
-        </w:rPr>
-        <w:t>Área: Atención al Cliente (ATC) &amp; Ventas | Versión 1.0 Oficial para Revisión y Firma</w:t>
+        <w:t>FORMATEX WMS 360° · ESPECIFICACIÓN DE REGLAS DE NEGOCIO Y OPERACIÓN</w:t>
       </w:r>
     </w:p>
     <w:p>
       <w:pPr>
-        <w:spacing w:before="240" w:after="80"/>
+        <w:spacing w:before="80" w:after="40"/>
       </w:pPr>
       <w:r>
         <w:rPr>
           <w:b/>
-          <w:color w:val="1E293B"/>
-          <w:sz w:val="44"/>
+          <w:color w:val="0F172A"/>
+          <w:sz w:val="40"/>
         </w:rPr>
-        <w:t>Especificación de Reglas de Negocio</w:t>
-        <w:br/>
-        <w:t>Módulo de Atención al Cliente (ATC)</w:t>
+        <w:t>Módulo de Atención al Cliente (ATC), Ventas &amp; Conexión Logística</w:t>
       </w:r>
     </w:p>
     <w:p>
       <w:pPr>
-        <w:spacing w:after="320"/>
+        <w:spacing w:after="280"/>
       </w:pPr>
       <w:r>
         <w:rPr>
           <w:i/>
-          <w:color w:val="4F46E5"/>
+          <w:color w:val="64748B"/>
           <w:sz w:val="22"/>
         </w:rPr>
-        <w:t>Documento de Levantamiento Operativo, Definición de Procesos y Marco Vinculante de Alcance</w:t>
-        <w:br/>
+        <w:t>Versión 1.1 Oficial Consolidada · Revisión Integral Sesión #2 (21 de Octubre de 2026)</w:t>
       </w:r>
     </w:p>
     <w:tbl>
@@ -69,17 +58,20 @@
             <w:tcW w:type="dxa" w:w="3168"/>
             <w:shd w:fill="F1F5F9"/>
             <w:tcMar>
-              <w:top w:w="70" w:type="dxa"/>
-              <w:bottom w:w="70" w:type="dxa"/>
+              <w:top w:w="80" w:type="dxa"/>
+              <w:bottom w:w="80" w:type="dxa"/>
               <w:left w:w="100" w:type="dxa"/>
               <w:right w:w="100" w:type="dxa"/>
             </w:tcMar>
           </w:tcPr>
           <w:p>
+            <w:pPr>
+              <w:spacing w:after="20"/>
+            </w:pPr>
             <w:r>
               <w:rPr>
                 <w:b/>
-                <w:color w:val="334155"/>
+                <w:color w:val="0F172A"/>
                 <w:sz w:val="19"/>
               </w:rPr>
               <w:t>Organización Solicitante:</w:t>
@@ -89,17 +81,21 @@
         <w:tc>
           <w:tcPr>
             <w:tcW w:type="dxa" w:w="6480"/>
-            <w:shd w:fill="FFFFFF"/>
+            <w:shd w:fill="F8FAFC"/>
             <w:tcMar>
-              <w:top w:w="70" w:type="dxa"/>
-              <w:bottom w:w="70" w:type="dxa"/>
+              <w:top w:w="80" w:type="dxa"/>
+              <w:bottom w:w="80" w:type="dxa"/>
               <w:left w:w="100" w:type="dxa"/>
               <w:right w:w="100" w:type="dxa"/>
             </w:tcMar>
           </w:tcPr>
           <w:p>
+            <w:pPr>
+              <w:spacing w:after="20"/>
+            </w:pPr>
             <w:r>
               <w:rPr>
+                <w:color w:val="1E293B"/>
                 <w:sz w:val="19"/>
               </w:rPr>
               <w:t>Forma Textil S. de R.L. de C.V. (Formatex)</w:t>
@@ -113,37 +109,44 @@
             <w:tcW w:type="dxa" w:w="3168"/>
             <w:shd w:fill="F1F5F9"/>
             <w:tcMar>
-              <w:top w:w="70" w:type="dxa"/>
-              <w:bottom w:w="70" w:type="dxa"/>
+              <w:top w:w="80" w:type="dxa"/>
+              <w:bottom w:w="80" w:type="dxa"/>
               <w:left w:w="100" w:type="dxa"/>
               <w:right w:w="100" w:type="dxa"/>
             </w:tcMar>
           </w:tcPr>
           <w:p>
+            <w:pPr>
+              <w:spacing w:after="20"/>
+            </w:pPr>
             <w:r>
               <w:rPr>
                 <w:b/>
-                <w:color w:val="334155"/>
+                <w:color w:val="0F172A"/>
                 <w:sz w:val="19"/>
               </w:rPr>
-              <w:t>Proveedor de Ingeniería:</w:t>
+              <w:t>Socio Tecnológico:</w:t>
             </w:r>
           </w:p>
         </w:tc>
         <w:tc>
           <w:tcPr>
             <w:tcW w:type="dxa" w:w="6480"/>
-            <w:shd w:fill="FFFFFF"/>
+            <w:shd w:fill="F8FAFC"/>
             <w:tcMar>
-              <w:top w:w="70" w:type="dxa"/>
-              <w:bottom w:w="70" w:type="dxa"/>
+              <w:top w:w="80" w:type="dxa"/>
+              <w:bottom w:w="80" w:type="dxa"/>
               <w:left w:w="100" w:type="dxa"/>
               <w:right w:w="100" w:type="dxa"/>
             </w:tcMar>
           </w:tcPr>
           <w:p>
+            <w:pPr>
+              <w:spacing w:after="20"/>
+            </w:pPr>
             <w:r>
               <w:rPr>
+                <w:color w:val="1E293B"/>
                 <w:sz w:val="19"/>
               </w:rPr>
               <w:t>Movida TCI LLC</w:t>
@@ -157,40 +160,47 @@
             <w:tcW w:type="dxa" w:w="3168"/>
             <w:shd w:fill="F1F5F9"/>
             <w:tcMar>
-              <w:top w:w="70" w:type="dxa"/>
-              <w:bottom w:w="70" w:type="dxa"/>
+              <w:top w:w="80" w:type="dxa"/>
+              <w:bottom w:w="80" w:type="dxa"/>
               <w:left w:w="100" w:type="dxa"/>
               <w:right w:w="100" w:type="dxa"/>
             </w:tcMar>
           </w:tcPr>
           <w:p>
+            <w:pPr>
+              <w:spacing w:after="20"/>
+            </w:pPr>
             <w:r>
               <w:rPr>
                 <w:b/>
-                <w:color w:val="334155"/>
+                <w:color w:val="0F172A"/>
                 <w:sz w:val="19"/>
               </w:rPr>
-              <w:t>Fecha de Levantamiento:</w:t>
+              <w:t>Fechas de Levantamiento:</w:t>
             </w:r>
           </w:p>
         </w:tc>
         <w:tc>
           <w:tcPr>
             <w:tcW w:type="dxa" w:w="6480"/>
-            <w:shd w:fill="FFFFFF"/>
+            <w:shd w:fill="F8FAFC"/>
             <w:tcMar>
-              <w:top w:w="70" w:type="dxa"/>
-              <w:bottom w:w="70" w:type="dxa"/>
+              <w:top w:w="80" w:type="dxa"/>
+              <w:bottom w:w="80" w:type="dxa"/>
               <w:left w:w="100" w:type="dxa"/>
               <w:right w:w="100" w:type="dxa"/>
             </w:tcMar>
           </w:tcPr>
           <w:p>
+            <w:pPr>
+              <w:spacing w:after="20"/>
+            </w:pPr>
             <w:r>
               <w:rPr>
+                <w:color w:val="1E293B"/>
                 <w:sz w:val="19"/>
               </w:rPr>
-              <w:t>Miércoles, 14 de Octubre de 2026</w:t>
+              <w:t>Sesión #1: 14/Oct/2026 | Sesión #2: 21/Oct/2026</w:t>
             </w:r>
           </w:p>
         </w:tc>
@@ -201,42 +211,47 @@
             <w:tcW w:type="dxa" w:w="3168"/>
             <w:shd w:fill="F1F5F9"/>
             <w:tcMar>
-              <w:top w:w="70" w:type="dxa"/>
-              <w:bottom w:w="70" w:type="dxa"/>
+              <w:top w:w="80" w:type="dxa"/>
+              <w:bottom w:w="80" w:type="dxa"/>
               <w:left w:w="100" w:type="dxa"/>
               <w:right w:w="100" w:type="dxa"/>
             </w:tcMar>
           </w:tcPr>
           <w:p>
+            <w:pPr>
+              <w:spacing w:after="20"/>
+            </w:pPr>
             <w:r>
               <w:rPr>
                 <w:b/>
-                <w:color w:val="334155"/>
+                <w:color w:val="0F172A"/>
                 <w:sz w:val="19"/>
               </w:rPr>
-              <w:t>Participantes de la Sesión:</w:t>
+              <w:t>Participantes de Formatex:</w:t>
             </w:r>
           </w:p>
         </w:tc>
         <w:tc>
           <w:tcPr>
             <w:tcW w:type="dxa" w:w="6480"/>
-            <w:shd w:fill="FFFFFF"/>
+            <w:shd w:fill="F8FAFC"/>
             <w:tcMar>
-              <w:top w:w="70" w:type="dxa"/>
-              <w:bottom w:w="70" w:type="dxa"/>
+              <w:top w:w="80" w:type="dxa"/>
+              <w:bottom w:w="80" w:type="dxa"/>
               <w:left w:w="100" w:type="dxa"/>
               <w:right w:w="100" w:type="dxa"/>
             </w:tcMar>
           </w:tcPr>
           <w:p>
+            <w:pPr>
+              <w:spacing w:after="20"/>
+            </w:pPr>
             <w:r>
               <w:rPr>
+                <w:color w:val="1E293B"/>
                 <w:sz w:val="19"/>
               </w:rPr>
-              <w:t>Alma (Líder Servicio al Cliente), Andrea Ramírez (ATC / Operaciones),</w:t>
-              <w:br/>
-              <w:t>Ricardo Zerpa (Arquitectura Movida TCI), Jonathan Palacios (Líder Técnico Movida TCI)</w:t>
+              <w:t>Alma (Jefa ATC), Andrea Ramírez (ATC/Operaciones), Santiago (Comercial), Nayeli (ATC Web)</w:t>
             </w:r>
           </w:p>
         </w:tc>
@@ -247,40 +262,47 @@
             <w:tcW w:type="dxa" w:w="3168"/>
             <w:shd w:fill="F1F5F9"/>
             <w:tcMar>
-              <w:top w:w="70" w:type="dxa"/>
-              <w:bottom w:w="70" w:type="dxa"/>
+              <w:top w:w="80" w:type="dxa"/>
+              <w:bottom w:w="80" w:type="dxa"/>
               <w:left w:w="100" w:type="dxa"/>
               <w:right w:w="100" w:type="dxa"/>
             </w:tcMar>
           </w:tcPr>
           <w:p>
+            <w:pPr>
+              <w:spacing w:after="20"/>
+            </w:pPr>
             <w:r>
               <w:rPr>
                 <w:b/>
-                <w:color w:val="334155"/>
+                <w:color w:val="0F172A"/>
                 <w:sz w:val="19"/>
               </w:rPr>
-              <w:t>Estatus del Entregable:</w:t>
+              <w:t>Participantes de Movida TCI:</w:t>
             </w:r>
           </w:p>
         </w:tc>
         <w:tc>
           <w:tcPr>
             <w:tcW w:type="dxa" w:w="6480"/>
-            <w:shd w:fill="FFFFFF"/>
+            <w:shd w:fill="F8FAFC"/>
             <w:tcMar>
-              <w:top w:w="70" w:type="dxa"/>
-              <w:bottom w:w="70" w:type="dxa"/>
+              <w:top w:w="80" w:type="dxa"/>
+              <w:bottom w:w="80" w:type="dxa"/>
               <w:left w:w="100" w:type="dxa"/>
               <w:right w:w="100" w:type="dxa"/>
             </w:tcMar>
           </w:tcPr>
           <w:p>
+            <w:pPr>
+              <w:spacing w:after="20"/>
+            </w:pPr>
             <w:r>
               <w:rPr>
+                <w:color w:val="1E293B"/>
                 <w:sz w:val="19"/>
               </w:rPr>
-              <w:t>Versión 1.0 — Documento Vinculante para Validación, Firma y Control de Cambios</w:t>
+              <w:t>Ricardo Zerpa (Arquitectura de Procesos), Jonathan Palacios (Dirección Técnica)</w:t>
             </w:r>
           </w:p>
         </w:tc>
@@ -288,27 +310,26 @@
     </w:tbl>
     <w:p>
       <w:pPr>
-        <w:spacing w:after="240"/>
+        <w:spacing w:after="160"/>
       </w:pPr>
     </w:p>
     <w:p>
       <w:pPr>
-        <w:pStyle w:val="Heading1"/>
-        <w:spacing w:before="280" w:after="120"/>
+        <w:keepNext/>
+        <w:spacing w:before="320" w:after="120"/>
       </w:pPr>
       <w:r>
         <w:rPr>
-          <w:color w:val="1E293B"/>
+          <w:b/>
+          <w:color w:val="3730A3"/>
+          <w:sz w:val="28"/>
         </w:rPr>
         <w:t>1. Propósito y Marco de Aceptación Vinculante</w:t>
       </w:r>
     </w:p>
     <w:p>
       <w:r>
-        <w:t>El presente documento tiene como finalidad plasmar de manera detallada, transparente e inequívoca todas las reglas de negocio, requerimientos operativos, candados de seguridad y flujos de trabajo levantados y consensuados durante la sesión de trabajo sostenida con el equipo de Atención al Cliente (ATC) de Formatex el 14 de octubre de 2026.</w:t>
-        <w:br/>
-        <w:br/>
-        <w:t>Este documento servirá como memoria formal y anexo técnico vinculante. Una vez revisado y firmado por ambas partes, delimitará el comportamiento oficial que tendrá el módulo de Atención al Cliente y Ventas en el sistema WMS 360+ Formatex, previniendo ambigüedades sobre lo solicitado, lo comprometido y los criterios de aceptación durante las pruebas de usuario y la puesta en marcha.</w:t>
+        <w:t>El presente documento recopila y formaliza de manera transparente y exhaustiva todas las reglas de negocio, candados de seguridad operativa y flujos de trabajo consensuados durante las sesiones operativas del 14 y 21 de octubre de 2026 entre el equipo de Atención al Cliente (ATC) de Formatex y Movida TCI.</w:t>
       </w:r>
     </w:p>
     <w:tbl>
@@ -333,19 +354,23 @@
             </w:tcMar>
           </w:tcPr>
           <w:p>
+            <w:pPr>
+              <w:spacing w:after="40"/>
+            </w:pPr>
             <w:r>
               <w:rPr>
                 <w:b/>
-                <w:color w:val="1E40AF"/>
+                <w:color w:val="3730A3"/>
+                <w:sz w:val="19"/>
               </w:rPr>
-              <w:t>Principio Rector del Sistema 360° Formatex:</w:t>
-              <w:br/>
+              <w:t xml:space="preserve">FINALIDAD OPERATIVA Y CONTRACTUAL: </w:t>
             </w:r>
             <w:r>
               <w:rPr>
+                <w:color w:val="1E3A8A"/>
                 <w:sz w:val="19"/>
               </w:rPr>
-              <w:t>El área de Atención al Cliente es el nodo neurálgico que conecta las ventas de calle con el inventario físico de bodega, cobranza y logística de despacho. Todo dato ingresado en este módulo debe viajar con trazabilidad estricta, eliminando hojas de cálculo paralelas, erradicando errores de captura manual y asegurando que las decisiones comerciales cuenten con autorización gerencial explícita.</w:t>
+              <w:t>Este documento actúa como anexo técnico vinculante. Su propósito es dejar por escrito el alcance, las excepciones y los criterios de aceptación para que ambas partes cuenten con un estándar único y homologado, evitando discrepancias futuras y garantizando que el WMS 360° responda exactamente a las necesidades operativas de Formatex.</w:t>
             </w:r>
           </w:p>
         </w:tc>
@@ -353,74 +378,188 @@
     </w:tbl>
     <w:p>
       <w:pPr>
-        <w:spacing w:after="160"/>
+        <w:spacing w:after="80"/>
       </w:pPr>
     </w:p>
     <w:p>
       <w:pPr>
-        <w:pStyle w:val="Heading1"/>
-        <w:spacing w:before="280"/>
+        <w:keepNext/>
+        <w:spacing w:before="320" w:after="120"/>
       </w:pPr>
       <w:r>
         <w:rPr>
-          <w:color w:val="1E293B"/>
+          <w:b/>
+          <w:color w:val="3730A3"/>
+          <w:sz w:val="28"/>
         </w:rPr>
-        <w:t>2. Regla de Negocio 1: Registro y Perfilado de Clientes</w:t>
+        <w:t>2. Regla de Negocio 1: Registro y Perfilado Integral de Clientes</w:t>
+      </w:r>
+    </w:p>
+    <w:p>
+      <w:pPr>
+        <w:keepNext/>
+        <w:spacing w:before="240" w:after="80"/>
+      </w:pPr>
+      <w:r>
+        <w:rPr>
+          <w:b/>
+          <w:color w:val="0F172A"/>
+          <w:sz w:val="24"/>
+        </w:rPr>
+        <w:t>2.1. Origen y Responsabilidad del Alta</w:t>
+      </w:r>
+    </w:p>
+    <w:p>
+      <w:pPr>
+        <w:pStyle w:val="ListBullet"/>
+        <w:spacing w:before="20" w:after="60"/>
+      </w:pPr>
+      <w:r>
+        <w:rPr>
+          <w:b/>
+          <w:color w:val="0F172A"/>
+        </w:rPr>
+        <w:t xml:space="preserve">Canal Comercial: </w:t>
+      </w:r>
+      <w:r>
+        <w:t>Los agentes comerciales foráneos y locales ('callejeros') recopilan y envían la documentación de los prospectos por correo o mensajería.</w:t>
+      </w:r>
+    </w:p>
+    <w:p>
+      <w:pPr>
+        <w:pStyle w:val="ListBullet"/>
+        <w:spacing w:before="20" w:after="60"/>
+      </w:pPr>
+      <w:r>
+        <w:rPr>
+          <w:b/>
+          <w:color w:val="0F172A"/>
+        </w:rPr>
+        <w:t xml:space="preserve">Facultad Exclusiva: </w:t>
+      </w:r>
+      <w:r>
+        <w:t>El personal de Atención al Cliente (ATC) es el único facultado para registrar el alta formal del cliente en el sistema.</w:t>
+      </w:r>
+    </w:p>
+    <w:p>
+      <w:pPr>
+        <w:keepNext/>
+        <w:spacing w:before="240" w:after="80"/>
+      </w:pPr>
+      <w:r>
+        <w:rPr>
+          <w:b/>
+          <w:color w:val="0F172A"/>
+          <w:sz w:val="24"/>
+        </w:rPr>
+        <w:t>2.2. Expediente Digital Obligatorio del Cliente</w:t>
       </w:r>
     </w:p>
     <w:p>
       <w:r>
-        <w:t>2.1. Origen y Responsabilidad del Registro:</w:t>
-        <w:br/>
-        <w:t>• El proceso comercial inicia cuando los agentes de ventas foráneos y locales ('callejeros') envían por correo o mensajería la documentación completa del prospecto.</w:t>
-        <w:br/>
-        <w:t>• El personal de Atención al Cliente (ATC) es el único facultado para registrar el alta formal del cliente en el WMS.</w:t>
-        <w:br/>
-        <w:br/>
-        <w:t>2.2. Expediente Digital Obligatorio del Cliente:</w:t>
-        <w:br/>
-        <w:t>Para que un cliente sea habilitado para recibir cotizaciones a crédito o de mayoreo, ATC deberá corroborar y registrar:</w:t>
-        <w:br/>
-        <w:t xml:space="preserve">  a) Razón Social y RFC validado contra la Constancia de Situación Fiscal (CSF).</w:t>
-        <w:br/>
-        <w:t xml:space="preserve">  b) Domicilio Fiscal Matriz (calle, número exterior/interior, colonia, municipio, estado, C.P.).</w:t>
-        <w:br/>
-        <w:t xml:space="preserve">  c) Carta de Selección de Fletera Oficial debidamente firmada por el cliente, en donde se especifica si contrata o declina el seguro de transporte de mercancía en carretera.</w:t>
-        <w:br/>
-        <w:t xml:space="preserve">  d) Contacto de Compras y Contacto de Pagos/Tesorería (teléfono fijo, celular directo y correo para envío automático de CFDI).</w:t>
-        <w:br/>
-        <w:br/>
-        <w:t>2.3. Estructura Multi-Domicilio (Destinos Alternos de Entrega):</w:t>
-        <w:br/>
-        <w:t>• En la práctica textil de Formatex, la mayoría de los clientes fabricantes o distribuidores no reciben la tela en su domicilio fiscal, sino en talleres de tapicería externos, sucursales o bodegas alternas (ej. Bodega Zapopan, Taller Tapicería Punto Sur).</w:t>
-        <w:br/>
-        <w:t>• El WMS permite asociar N domicilios de entrega a cada cliente, identificando para cada uno: alias de la sucursal, dirección completa, nombre del encargado de almacén que recibe, teléfono móvil directo y horario de recepción autorizado.</w:t>
-        <w:br/>
-        <w:br/>
-        <w:t>2.4. Tratamiento Diferenciado para Clientes Web / Ocasionales:</w:t>
-        <w:br/>
-        <w:t>• Los clientes que realizan compras esporádicas a través de la página web (personas físicas de una sola compra) no se mezclan con el catálogo mayorista de ATC, sino que son gestionados por la Asesora de Servicio a Clientes del área de Marketing.</w:t>
-        <w:br/>
-        <w:t>• En estos casos se aplican precios de lista web sin requerir alta corporativa, emitiéndose factura al público en general (RFC genérico) o CFDI individual si el usuario lo solicita expresamente.</w:t>
+        <w:t>Para autorizar cotizaciones de mayoreo o líneas de crédito, ATC captura y valida:</w:t>
       </w:r>
     </w:p>
     <w:p>
       <w:pPr>
-        <w:pStyle w:val="Heading1"/>
-        <w:spacing w:before="280"/>
+        <w:pStyle w:val="ListBullet"/>
+        <w:spacing w:before="20" w:after="60"/>
       </w:pPr>
       <w:r>
         <w:rPr>
-          <w:color w:val="1E293B"/>
+          <w:b/>
+          <w:color w:val="0F172A"/>
         </w:rPr>
-        <w:t>3. Regla de Negocio 2: Catálogo de Listas de Precios y Gobernanza de Modificación</w:t>
+        <w:t xml:space="preserve">Razón Social y RFC: </w:t>
+      </w:r>
+      <w:r>
+        <w:t>Validado contra la Constancia de Situación Fiscal (CSF) emitida por el SAT.</w:t>
+      </w:r>
+    </w:p>
+    <w:p>
+      <w:pPr>
+        <w:pStyle w:val="ListBullet"/>
+        <w:spacing w:before="20" w:after="60"/>
+      </w:pPr>
+      <w:r>
+        <w:rPr>
+          <w:b/>
+          <w:color w:val="0F172A"/>
+        </w:rPr>
+        <w:t xml:space="preserve">Domicilio Fiscal Matriz: </w:t>
+      </w:r>
+      <w:r>
+        <w:t>Calle, Número exterior/interior, Colonia, Municipio, Estado, Código Postal.</w:t>
+      </w:r>
+    </w:p>
+    <w:p>
+      <w:pPr>
+        <w:pStyle w:val="ListBullet"/>
+        <w:spacing w:before="20" w:after="60"/>
+      </w:pPr>
+      <w:r>
+        <w:rPr>
+          <w:b/>
+          <w:color w:val="0F172A"/>
+        </w:rPr>
+        <w:t xml:space="preserve">Carta de Fletera Oficial: </w:t>
+      </w:r>
+      <w:r>
+        <w:t>Firmada por el cliente, donde ratifica la empresa de transporte de su preferencia y si contrata o declina el seguro de carga ante siniestros.</w:t>
+      </w:r>
+    </w:p>
+    <w:p>
+      <w:pPr>
+        <w:pStyle w:val="ListBullet"/>
+        <w:spacing w:before="20" w:after="60"/>
+      </w:pPr>
+      <w:r>
+        <w:rPr>
+          <w:b/>
+          <w:color w:val="0F172A"/>
+        </w:rPr>
+        <w:t xml:space="preserve">Datos de Contacto Clave: </w:t>
+      </w:r>
+      <w:r>
+        <w:t>Nombre, teléfono celular directo y correo para envío automático de facturas CFDI 4.0.</w:t>
+      </w:r>
+    </w:p>
+    <w:p>
+      <w:pPr>
+        <w:keepNext/>
+        <w:spacing w:before="240" w:after="80"/>
+      </w:pPr>
+      <w:r>
+        <w:rPr>
+          <w:b/>
+          <w:color w:val="0F172A"/>
+          <w:sz w:val="24"/>
+        </w:rPr>
+        <w:t>2.3. Estructura Multi-Domicilio (Destinos Alternos de Entrega)</w:t>
       </w:r>
     </w:p>
     <w:p>
       <w:r>
-        <w:t>3.1. Las 10 Listas Oficiales de Formatex:</w:t>
-        <w:br/>
-        <w:t>El sistema reemplaza cualquier esquema genérico anterior para adoptar de forma estricta las 10 listas oficiales informadas por la jefatura de ATC, cada una vinculada al perfil comercial del comprador:</w:t>
+        <w:t>Un mismo cliente fiscal suele despachar a múltiples destinos físicos (sucursales, bodegas regionales o talleres de tapicería externos). El WMS permite registrar N domicilios de entrega por cliente, guardando alias, dirección completa, receptor, teléfono y horarios permitidos.</w:t>
+      </w:r>
+    </w:p>
+    <w:p>
+      <w:pPr>
+        <w:keepNext/>
+        <w:spacing w:before="320" w:after="120"/>
+      </w:pPr>
+      <w:r>
+        <w:rPr>
+          <w:b/>
+          <w:color w:val="3730A3"/>
+          <w:sz w:val="28"/>
+        </w:rPr>
+        <w:t>3. Regla de Negocio 2: Las 10 Listas de Precios Oficiales y Candados de Modificación</w:t>
+      </w:r>
+    </w:p>
+    <w:p>
+      <w:r>
+        <w:t>El WMS descarta cualquier nomenclatura genérica y adopta el catálogo oficial proporcionado por la jefatura de ATC. Las listas F3, F5, F7 y F9 cuentan con candados gerenciales estrictos que exigen aprobación previa de Dirección para ser asignadas:</w:t>
       </w:r>
     </w:p>
     <w:tbl>
@@ -444,8 +583,8 @@
             <w:tcMar>
               <w:top w:w="80" w:type="dxa"/>
               <w:bottom w:w="80" w:type="dxa"/>
-              <w:left w:w="90" w:type="dxa"/>
-              <w:right w:w="90" w:type="dxa"/>
+              <w:left w:w="100" w:type="dxa"/>
+              <w:right w:w="100" w:type="dxa"/>
             </w:tcMar>
           </w:tcPr>
           <w:p>
@@ -453,9 +592,9 @@
               <w:rPr>
                 <w:b/>
                 <w:color w:val="FFFFFF"/>
-                <w:sz w:val="17"/>
+                <w:sz w:val="18"/>
               </w:rPr>
-              <w:t>Código</w:t>
+              <w:t>Lista</w:t>
             </w:r>
           </w:p>
         </w:tc>
@@ -466,8 +605,8 @@
             <w:tcMar>
               <w:top w:w="80" w:type="dxa"/>
               <w:bottom w:w="80" w:type="dxa"/>
-              <w:left w:w="90" w:type="dxa"/>
-              <w:right w:w="90" w:type="dxa"/>
+              <w:left w:w="100" w:type="dxa"/>
+              <w:right w:w="100" w:type="dxa"/>
             </w:tcMar>
           </w:tcPr>
           <w:p>
@@ -475,7 +614,7 @@
               <w:rPr>
                 <w:b/>
                 <w:color w:val="FFFFFF"/>
-                <w:sz w:val="17"/>
+                <w:sz w:val="18"/>
               </w:rPr>
               <w:t>Nombre de la Lista</w:t>
             </w:r>
@@ -488,8 +627,8 @@
             <w:tcMar>
               <w:top w:w="80" w:type="dxa"/>
               <w:bottom w:w="80" w:type="dxa"/>
-              <w:left w:w="90" w:type="dxa"/>
-              <w:right w:w="90" w:type="dxa"/>
+              <w:left w:w="100" w:type="dxa"/>
+              <w:right w:w="100" w:type="dxa"/>
             </w:tcMar>
           </w:tcPr>
           <w:p>
@@ -497,9 +636,9 @@
               <w:rPr>
                 <w:b/>
                 <w:color w:val="FFFFFF"/>
-                <w:sz w:val="17"/>
+                <w:sz w:val="18"/>
               </w:rPr>
-              <w:t>Perfil Objetivo</w:t>
+              <w:t>Perfil Comercial Objetivo</w:t>
             </w:r>
           </w:p>
         </w:tc>
@@ -510,8 +649,8 @@
             <w:tcMar>
               <w:top w:w="80" w:type="dxa"/>
               <w:bottom w:w="80" w:type="dxa"/>
-              <w:left w:w="90" w:type="dxa"/>
-              <w:right w:w="90" w:type="dxa"/>
+              <w:left w:w="100" w:type="dxa"/>
+              <w:right w:w="100" w:type="dxa"/>
             </w:tcMar>
           </w:tcPr>
           <w:p>
@@ -519,9 +658,9 @@
               <w:rPr>
                 <w:b/>
                 <w:color w:val="FFFFFF"/>
-                <w:sz w:val="17"/>
+                <w:sz w:val="18"/>
               </w:rPr>
-              <w:t>Nivel de Autorización Requerido</w:t>
+              <w:t>Candado de Autorización</w:t>
             </w:r>
           </w:p>
         </w:tc>
@@ -529,11 +668,11 @@
       <w:tr>
         <w:tc>
           <w:tcPr>
-            <w:tcW w:type="dxa" w:w="1152"/>
+            <w:tcW w:type="dxa" w:w="2412"/>
             <w:shd w:fill="F8FAFC"/>
             <w:tcMar>
-              <w:top w:w="50" w:type="dxa"/>
-              <w:bottom w:w="50" w:type="dxa"/>
+              <w:top w:w="60" w:type="dxa"/>
+              <w:bottom w:w="60" w:type="dxa"/>
               <w:left w:w="80" w:type="dxa"/>
               <w:right w:w="80" w:type="dxa"/>
             </w:tcMar>
@@ -550,11 +689,11 @@
         </w:tc>
         <w:tc>
           <w:tcPr>
-            <w:tcW w:type="dxa" w:w="2592"/>
+            <w:tcW w:type="dxa" w:w="2412"/>
             <w:shd w:fill="F8FAFC"/>
             <w:tcMar>
-              <w:top w:w="50" w:type="dxa"/>
-              <w:bottom w:w="50" w:type="dxa"/>
+              <w:top w:w="60" w:type="dxa"/>
+              <w:bottom w:w="60" w:type="dxa"/>
               <w:left w:w="80" w:type="dxa"/>
               <w:right w:w="80" w:type="dxa"/>
             </w:tcMar>
@@ -570,11 +709,11 @@
         </w:tc>
         <w:tc>
           <w:tcPr>
-            <w:tcW w:type="dxa" w:w="3312"/>
+            <w:tcW w:type="dxa" w:w="2412"/>
             <w:shd w:fill="F8FAFC"/>
             <w:tcMar>
-              <w:top w:w="50" w:type="dxa"/>
-              <w:bottom w:w="50" w:type="dxa"/>
+              <w:top w:w="60" w:type="dxa"/>
+              <w:bottom w:w="60" w:type="dxa"/>
               <w:left w:w="80" w:type="dxa"/>
               <w:right w:w="80" w:type="dxa"/>
             </w:tcMar>
@@ -590,11 +729,11 @@
         </w:tc>
         <w:tc>
           <w:tcPr>
-            <w:tcW w:type="dxa" w:w="2592"/>
+            <w:tcW w:type="dxa" w:w="2412"/>
             <w:shd w:fill="F8FAFC"/>
             <w:tcMar>
-              <w:top w:w="50" w:type="dxa"/>
-              <w:bottom w:w="50" w:type="dxa"/>
+              <w:top w:w="60" w:type="dxa"/>
+              <w:bottom w:w="60" w:type="dxa"/>
               <w:left w:w="80" w:type="dxa"/>
               <w:right w:w="80" w:type="dxa"/>
             </w:tcMar>
@@ -612,11 +751,11 @@
       <w:tr>
         <w:tc>
           <w:tcPr>
-            <w:tcW w:type="dxa" w:w="1152"/>
+            <w:tcW w:type="dxa" w:w="2412"/>
             <w:shd w:fill="FFFFFF"/>
             <w:tcMar>
-              <w:top w:w="50" w:type="dxa"/>
-              <w:bottom w:w="50" w:type="dxa"/>
+              <w:top w:w="60" w:type="dxa"/>
+              <w:bottom w:w="60" w:type="dxa"/>
               <w:left w:w="80" w:type="dxa"/>
               <w:right w:w="80" w:type="dxa"/>
             </w:tcMar>
@@ -633,11 +772,11 @@
         </w:tc>
         <w:tc>
           <w:tcPr>
-            <w:tcW w:type="dxa" w:w="2592"/>
+            <w:tcW w:type="dxa" w:w="2412"/>
             <w:shd w:fill="FFFFFF"/>
             <w:tcMar>
-              <w:top w:w="50" w:type="dxa"/>
-              <w:bottom w:w="50" w:type="dxa"/>
+              <w:top w:w="60" w:type="dxa"/>
+              <w:bottom w:w="60" w:type="dxa"/>
               <w:left w:w="80" w:type="dxa"/>
               <w:right w:w="80" w:type="dxa"/>
             </w:tcMar>
@@ -647,17 +786,17 @@
               <w:rPr>
                 <w:sz w:val="17"/>
               </w:rPr>
-              <w:t>Tienda</w:t>
+              <w:t>Tienda Especial</w:t>
             </w:r>
           </w:p>
         </w:tc>
         <w:tc>
           <w:tcPr>
-            <w:tcW w:type="dxa" w:w="3312"/>
+            <w:tcW w:type="dxa" w:w="2412"/>
             <w:shd w:fill="FFFFFF"/>
             <w:tcMar>
-              <w:top w:w="50" w:type="dxa"/>
-              <w:bottom w:w="50" w:type="dxa"/>
+              <w:top w:w="60" w:type="dxa"/>
+              <w:bottom w:w="60" w:type="dxa"/>
               <w:left w:w="80" w:type="dxa"/>
               <w:right w:w="80" w:type="dxa"/>
             </w:tcMar>
@@ -667,17 +806,17 @@
               <w:rPr>
                 <w:sz w:val="17"/>
               </w:rPr>
-              <w:t>Locales comerciales de venta de tela y retail</w:t>
+              <w:t>Tiendas de retail textil, tapicerías medianas y talleres de diseño</w:t>
             </w:r>
           </w:p>
         </w:tc>
         <w:tc>
           <w:tcPr>
-            <w:tcW w:type="dxa" w:w="2592"/>
+            <w:tcW w:type="dxa" w:w="2412"/>
             <w:shd w:fill="FFFFFF"/>
             <w:tcMar>
-              <w:top w:w="50" w:type="dxa"/>
-              <w:bottom w:w="50" w:type="dxa"/>
+              <w:top w:w="60" w:type="dxa"/>
+              <w:bottom w:w="60" w:type="dxa"/>
               <w:left w:w="80" w:type="dxa"/>
               <w:right w:w="80" w:type="dxa"/>
             </w:tcMar>
@@ -695,11 +834,11 @@
       <w:tr>
         <w:tc>
           <w:tcPr>
-            <w:tcW w:type="dxa" w:w="1152"/>
+            <w:tcW w:type="dxa" w:w="2412"/>
             <w:shd w:fill="F8FAFC"/>
             <w:tcMar>
-              <w:top w:w="50" w:type="dxa"/>
-              <w:bottom w:w="50" w:type="dxa"/>
+              <w:top w:w="60" w:type="dxa"/>
+              <w:bottom w:w="60" w:type="dxa"/>
               <w:left w:w="80" w:type="dxa"/>
               <w:right w:w="80" w:type="dxa"/>
             </w:tcMar>
@@ -716,11 +855,11 @@
         </w:tc>
         <w:tc>
           <w:tcPr>
-            <w:tcW w:type="dxa" w:w="2592"/>
+            <w:tcW w:type="dxa" w:w="2412"/>
             <w:shd w:fill="F8FAFC"/>
             <w:tcMar>
-              <w:top w:w="50" w:type="dxa"/>
-              <w:bottom w:w="50" w:type="dxa"/>
+              <w:top w:w="60" w:type="dxa"/>
+              <w:bottom w:w="60" w:type="dxa"/>
               <w:left w:w="80" w:type="dxa"/>
               <w:right w:w="80" w:type="dxa"/>
             </w:tcMar>
@@ -730,17 +869,17 @@
               <w:rPr>
                 <w:sz w:val="17"/>
               </w:rPr>
-              <w:t>Tienda Especial</w:t>
+              <w:t>Fabricante</w:t>
             </w:r>
           </w:p>
         </w:tc>
         <w:tc>
           <w:tcPr>
-            <w:tcW w:type="dxa" w:w="3312"/>
+            <w:tcW w:type="dxa" w:w="2412"/>
             <w:shd w:fill="F8FAFC"/>
             <w:tcMar>
-              <w:top w:w="50" w:type="dxa"/>
-              <w:bottom w:w="50" w:type="dxa"/>
+              <w:top w:w="60" w:type="dxa"/>
+              <w:bottom w:w="60" w:type="dxa"/>
               <w:left w:w="80" w:type="dxa"/>
               <w:right w:w="80" w:type="dxa"/>
             </w:tcMar>
@@ -750,17 +889,17 @@
               <w:rPr>
                 <w:sz w:val="17"/>
               </w:rPr>
-              <w:t>Tiendas con acuerdos de volumen intermedio</w:t>
+              <w:t>Plantas fabricantes de muebles y salas en volumen intermedio</w:t>
             </w:r>
           </w:p>
         </w:tc>
         <w:tc>
           <w:tcPr>
-            <w:tcW w:type="dxa" w:w="2592"/>
-            <w:shd w:fill="F8FAFC"/>
+            <w:tcW w:type="dxa" w:w="2412"/>
+            <w:shd w:fill="FEF3C7"/>
             <w:tcMar>
-              <w:top w:w="50" w:type="dxa"/>
-              <w:bottom w:w="50" w:type="dxa"/>
+              <w:top w:w="60" w:type="dxa"/>
+              <w:bottom w:w="60" w:type="dxa"/>
               <w:left w:w="80" w:type="dxa"/>
               <w:right w:w="80" w:type="dxa"/>
             </w:tcMar>
@@ -769,10 +908,10 @@
             <w:r>
               <w:rPr>
                 <w:b/>
-                <w:color w:val="B91C1C"/>
+                <w:color w:val="92400E"/>
                 <w:sz w:val="17"/>
               </w:rPr>
-              <w:t>REQUIERE AUTORIZACIÓN GERENCIAL (Alma)</w:t>
+              <w:t>REQUIERE AUTORIZACIÓN GERENCIAL 🔒</w:t>
             </w:r>
           </w:p>
         </w:tc>
@@ -780,11 +919,11 @@
       <w:tr>
         <w:tc>
           <w:tcPr>
-            <w:tcW w:type="dxa" w:w="1152"/>
+            <w:tcW w:type="dxa" w:w="2412"/>
             <w:shd w:fill="FFFFFF"/>
             <w:tcMar>
-              <w:top w:w="50" w:type="dxa"/>
-              <w:bottom w:w="50" w:type="dxa"/>
+              <w:top w:w="60" w:type="dxa"/>
+              <w:bottom w:w="60" w:type="dxa"/>
               <w:left w:w="80" w:type="dxa"/>
               <w:right w:w="80" w:type="dxa"/>
             </w:tcMar>
@@ -801,11 +940,11 @@
         </w:tc>
         <w:tc>
           <w:tcPr>
-            <w:tcW w:type="dxa" w:w="2592"/>
+            <w:tcW w:type="dxa" w:w="2412"/>
             <w:shd w:fill="FFFFFF"/>
             <w:tcMar>
-              <w:top w:w="50" w:type="dxa"/>
-              <w:bottom w:w="50" w:type="dxa"/>
+              <w:top w:w="60" w:type="dxa"/>
+              <w:bottom w:w="60" w:type="dxa"/>
               <w:left w:w="80" w:type="dxa"/>
               <w:right w:w="80" w:type="dxa"/>
             </w:tcMar>
@@ -815,17 +954,17 @@
               <w:rPr>
                 <w:sz w:val="17"/>
               </w:rPr>
-              <w:t>Fabricante</w:t>
+              <w:t>Distribuidor</w:t>
             </w:r>
           </w:p>
         </w:tc>
         <w:tc>
           <w:tcPr>
-            <w:tcW w:type="dxa" w:w="3312"/>
+            <w:tcW w:type="dxa" w:w="2412"/>
             <w:shd w:fill="FFFFFF"/>
             <w:tcMar>
-              <w:top w:w="50" w:type="dxa"/>
-              <w:bottom w:w="50" w:type="dxa"/>
+              <w:top w:w="60" w:type="dxa"/>
+              <w:bottom w:w="60" w:type="dxa"/>
               <w:left w:w="80" w:type="dxa"/>
               <w:right w:w="80" w:type="dxa"/>
             </w:tcMar>
@@ -835,17 +974,17 @@
               <w:rPr>
                 <w:sz w:val="17"/>
               </w:rPr>
-              <w:t>Fabricantes de muebles y tapicería estándar</w:t>
+              <w:t>Comercializadoras mayoristas y distribuidores regionales</w:t>
             </w:r>
           </w:p>
         </w:tc>
         <w:tc>
           <w:tcPr>
-            <w:tcW w:type="dxa" w:w="2592"/>
+            <w:tcW w:type="dxa" w:w="2412"/>
             <w:shd w:fill="FFFFFF"/>
             <w:tcMar>
-              <w:top w:w="50" w:type="dxa"/>
-              <w:bottom w:w="50" w:type="dxa"/>
+              <w:top w:w="60" w:type="dxa"/>
+              <w:bottom w:w="60" w:type="dxa"/>
               <w:left w:w="80" w:type="dxa"/>
               <w:right w:w="80" w:type="dxa"/>
             </w:tcMar>
@@ -863,11 +1002,11 @@
       <w:tr>
         <w:tc>
           <w:tcPr>
-            <w:tcW w:type="dxa" w:w="1152"/>
+            <w:tcW w:type="dxa" w:w="2412"/>
             <w:shd w:fill="F8FAFC"/>
             <w:tcMar>
-              <w:top w:w="50" w:type="dxa"/>
-              <w:bottom w:w="50" w:type="dxa"/>
+              <w:top w:w="60" w:type="dxa"/>
+              <w:bottom w:w="60" w:type="dxa"/>
               <w:left w:w="80" w:type="dxa"/>
               <w:right w:w="80" w:type="dxa"/>
             </w:tcMar>
@@ -884,11 +1023,11 @@
         </w:tc>
         <w:tc>
           <w:tcPr>
-            <w:tcW w:type="dxa" w:w="2592"/>
+            <w:tcW w:type="dxa" w:w="2412"/>
             <w:shd w:fill="F8FAFC"/>
             <w:tcMar>
-              <w:top w:w="50" w:type="dxa"/>
-              <w:bottom w:w="50" w:type="dxa"/>
+              <w:top w:w="60" w:type="dxa"/>
+              <w:bottom w:w="60" w:type="dxa"/>
               <w:left w:w="80" w:type="dxa"/>
               <w:right w:w="80" w:type="dxa"/>
             </w:tcMar>
@@ -898,17 +1037,17 @@
               <w:rPr>
                 <w:sz w:val="17"/>
               </w:rPr>
-              <w:t>Fabricante Especial</w:t>
+              <w:t>Distribuidor Especial</w:t>
             </w:r>
           </w:p>
         </w:tc>
         <w:tc>
           <w:tcPr>
-            <w:tcW w:type="dxa" w:w="3312"/>
+            <w:tcW w:type="dxa" w:w="2412"/>
             <w:shd w:fill="F8FAFC"/>
             <w:tcMar>
-              <w:top w:w="50" w:type="dxa"/>
-              <w:bottom w:w="50" w:type="dxa"/>
+              <w:top w:w="60" w:type="dxa"/>
+              <w:bottom w:w="60" w:type="dxa"/>
               <w:left w:w="80" w:type="dxa"/>
               <w:right w:w="80" w:type="dxa"/>
             </w:tcMar>
@@ -918,17 +1057,17 @@
               <w:rPr>
                 <w:sz w:val="17"/>
               </w:rPr>
-              <w:t>Fabricantes de gran escala con volumen preferencial</w:t>
+              <w:t>Distribuidores de alto desplazamiento con condiciones negociadas</w:t>
             </w:r>
           </w:p>
         </w:tc>
         <w:tc>
           <w:tcPr>
-            <w:tcW w:type="dxa" w:w="2592"/>
-            <w:shd w:fill="F8FAFC"/>
+            <w:tcW w:type="dxa" w:w="2412"/>
+            <w:shd w:fill="FEF3C7"/>
             <w:tcMar>
-              <w:top w:w="50" w:type="dxa"/>
-              <w:bottom w:w="50" w:type="dxa"/>
+              <w:top w:w="60" w:type="dxa"/>
+              <w:bottom w:w="60" w:type="dxa"/>
               <w:left w:w="80" w:type="dxa"/>
               <w:right w:w="80" w:type="dxa"/>
             </w:tcMar>
@@ -937,10 +1076,10 @@
             <w:r>
               <w:rPr>
                 <w:b/>
-                <w:color w:val="B91C1C"/>
+                <w:color w:val="92400E"/>
                 <w:sz w:val="17"/>
               </w:rPr>
-              <w:t>REQUIERE AUTORIZACIÓN GERENCIAL (Alma)</w:t>
+              <w:t>REQUIERE AUTORIZACIÓN GERENCIAL 🔒</w:t>
             </w:r>
           </w:p>
         </w:tc>
@@ -948,11 +1087,11 @@
       <w:tr>
         <w:tc>
           <w:tcPr>
-            <w:tcW w:type="dxa" w:w="1152"/>
+            <w:tcW w:type="dxa" w:w="2412"/>
             <w:shd w:fill="FFFFFF"/>
             <w:tcMar>
-              <w:top w:w="50" w:type="dxa"/>
-              <w:bottom w:w="50" w:type="dxa"/>
+              <w:top w:w="60" w:type="dxa"/>
+              <w:bottom w:w="60" w:type="dxa"/>
               <w:left w:w="80" w:type="dxa"/>
               <w:right w:w="80" w:type="dxa"/>
             </w:tcMar>
@@ -969,11 +1108,11 @@
         </w:tc>
         <w:tc>
           <w:tcPr>
-            <w:tcW w:type="dxa" w:w="2592"/>
+            <w:tcW w:type="dxa" w:w="2412"/>
             <w:shd w:fill="FFFFFF"/>
             <w:tcMar>
-              <w:top w:w="50" w:type="dxa"/>
-              <w:bottom w:w="50" w:type="dxa"/>
+              <w:top w:w="60" w:type="dxa"/>
+              <w:bottom w:w="60" w:type="dxa"/>
               <w:left w:w="80" w:type="dxa"/>
               <w:right w:w="80" w:type="dxa"/>
             </w:tcMar>
@@ -983,17 +1122,17 @@
               <w:rPr>
                 <w:sz w:val="17"/>
               </w:rPr>
-              <w:t>Distribuidor</w:t>
+              <w:t>Medio Mayorista</w:t>
             </w:r>
           </w:p>
         </w:tc>
         <w:tc>
           <w:tcPr>
-            <w:tcW w:type="dxa" w:w="3312"/>
+            <w:tcW w:type="dxa" w:w="2412"/>
             <w:shd w:fill="FFFFFF"/>
             <w:tcMar>
-              <w:top w:w="50" w:type="dxa"/>
-              <w:bottom w:w="50" w:type="dxa"/>
+              <w:top w:w="60" w:type="dxa"/>
+              <w:bottom w:w="60" w:type="dxa"/>
               <w:left w:w="80" w:type="dxa"/>
               <w:right w:w="80" w:type="dxa"/>
             </w:tcMar>
@@ -1003,17 +1142,17 @@
               <w:rPr>
                 <w:sz w:val="17"/>
               </w:rPr>
-              <w:t>Mayoristas de reventa regional</w:t>
+              <w:t>Talleres industriales y tapicerías de consumo continuo</w:t>
             </w:r>
           </w:p>
         </w:tc>
         <w:tc>
           <w:tcPr>
-            <w:tcW w:type="dxa" w:w="2592"/>
+            <w:tcW w:type="dxa" w:w="2412"/>
             <w:shd w:fill="FFFFFF"/>
             <w:tcMar>
-              <w:top w:w="50" w:type="dxa"/>
-              <w:bottom w:w="50" w:type="dxa"/>
+              <w:top w:w="60" w:type="dxa"/>
+              <w:bottom w:w="60" w:type="dxa"/>
               <w:left w:w="80" w:type="dxa"/>
               <w:right w:w="80" w:type="dxa"/>
             </w:tcMar>
@@ -1031,11 +1170,11 @@
       <w:tr>
         <w:tc>
           <w:tcPr>
-            <w:tcW w:type="dxa" w:w="1152"/>
+            <w:tcW w:type="dxa" w:w="2412"/>
             <w:shd w:fill="F8FAFC"/>
             <w:tcMar>
-              <w:top w:w="50" w:type="dxa"/>
-              <w:bottom w:w="50" w:type="dxa"/>
+              <w:top w:w="60" w:type="dxa"/>
+              <w:bottom w:w="60" w:type="dxa"/>
               <w:left w:w="80" w:type="dxa"/>
               <w:right w:w="80" w:type="dxa"/>
             </w:tcMar>
@@ -1052,11 +1191,11 @@
         </w:tc>
         <w:tc>
           <w:tcPr>
-            <w:tcW w:type="dxa" w:w="2592"/>
+            <w:tcW w:type="dxa" w:w="2412"/>
             <w:shd w:fill="F8FAFC"/>
             <w:tcMar>
-              <w:top w:w="50" w:type="dxa"/>
-              <w:bottom w:w="50" w:type="dxa"/>
+              <w:top w:w="60" w:type="dxa"/>
+              <w:bottom w:w="60" w:type="dxa"/>
               <w:left w:w="80" w:type="dxa"/>
               <w:right w:w="80" w:type="dxa"/>
             </w:tcMar>
@@ -1066,17 +1205,17 @@
               <w:rPr>
                 <w:sz w:val="17"/>
               </w:rPr>
-              <w:t>Distribuidor Especial</w:t>
+              <w:t>Gran Mayorista</w:t>
             </w:r>
           </w:p>
         </w:tc>
         <w:tc>
           <w:tcPr>
-            <w:tcW w:type="dxa" w:w="3312"/>
+            <w:tcW w:type="dxa" w:w="2412"/>
             <w:shd w:fill="F8FAFC"/>
             <w:tcMar>
-              <w:top w:w="50" w:type="dxa"/>
-              <w:bottom w:w="50" w:type="dxa"/>
+              <w:top w:w="60" w:type="dxa"/>
+              <w:bottom w:w="60" w:type="dxa"/>
               <w:left w:w="80" w:type="dxa"/>
               <w:right w:w="80" w:type="dxa"/>
             </w:tcMar>
@@ -1086,17 +1225,17 @@
               <w:rPr>
                 <w:sz w:val="17"/>
               </w:rPr>
-              <w:t>Distribuidores estratégicos de alto volumen</w:t>
+              <w:t>Cuentas corporativas de escala nacional (ej. Plasencia)</w:t>
             </w:r>
           </w:p>
         </w:tc>
         <w:tc>
           <w:tcPr>
-            <w:tcW w:type="dxa" w:w="2592"/>
-            <w:shd w:fill="F8FAFC"/>
+            <w:tcW w:type="dxa" w:w="2412"/>
+            <w:shd w:fill="FEF3C7"/>
             <w:tcMar>
-              <w:top w:w="50" w:type="dxa"/>
-              <w:bottom w:w="50" w:type="dxa"/>
+              <w:top w:w="60" w:type="dxa"/>
+              <w:bottom w:w="60" w:type="dxa"/>
               <w:left w:w="80" w:type="dxa"/>
               <w:right w:w="80" w:type="dxa"/>
             </w:tcMar>
@@ -1105,10 +1244,10 @@
             <w:r>
               <w:rPr>
                 <w:b/>
-                <w:color w:val="B91C1C"/>
+                <w:color w:val="92400E"/>
                 <w:sz w:val="17"/>
               </w:rPr>
-              <w:t>REQUIERE AUTORIZACIÓN GERENCIAL (Alma)</w:t>
+              <w:t>REQUIERE AUTORIZACIÓN GERENCIAL 🔒</w:t>
             </w:r>
           </w:p>
         </w:tc>
@@ -1116,11 +1255,11 @@
       <w:tr>
         <w:tc>
           <w:tcPr>
-            <w:tcW w:type="dxa" w:w="1152"/>
+            <w:tcW w:type="dxa" w:w="2412"/>
             <w:shd w:fill="FFFFFF"/>
             <w:tcMar>
-              <w:top w:w="50" w:type="dxa"/>
-              <w:bottom w:w="50" w:type="dxa"/>
+              <w:top w:w="60" w:type="dxa"/>
+              <w:bottom w:w="60" w:type="dxa"/>
               <w:left w:w="80" w:type="dxa"/>
               <w:right w:w="80" w:type="dxa"/>
             </w:tcMar>
@@ -1137,11 +1276,11 @@
         </w:tc>
         <w:tc>
           <w:tcPr>
-            <w:tcW w:type="dxa" w:w="2592"/>
+            <w:tcW w:type="dxa" w:w="2412"/>
             <w:shd w:fill="FFFFFF"/>
             <w:tcMar>
-              <w:top w:w="50" w:type="dxa"/>
-              <w:bottom w:w="50" w:type="dxa"/>
+              <w:top w:w="60" w:type="dxa"/>
+              <w:bottom w:w="60" w:type="dxa"/>
               <w:left w:w="80" w:type="dxa"/>
               <w:right w:w="80" w:type="dxa"/>
             </w:tcMar>
@@ -1151,17 +1290,17 @@
               <w:rPr>
                 <w:sz w:val="17"/>
               </w:rPr>
-              <w:t>Cliente Premium</w:t>
+              <w:t>Comprador de Rollo</w:t>
             </w:r>
           </w:p>
         </w:tc>
         <w:tc>
           <w:tcPr>
-            <w:tcW w:type="dxa" w:w="3312"/>
+            <w:tcW w:type="dxa" w:w="2412"/>
             <w:shd w:fill="FFFFFF"/>
             <w:tcMar>
-              <w:top w:w="50" w:type="dxa"/>
-              <w:bottom w:w="50" w:type="dxa"/>
+              <w:top w:w="60" w:type="dxa"/>
+              <w:bottom w:w="60" w:type="dxa"/>
               <w:left w:w="80" w:type="dxa"/>
               <w:right w:w="80" w:type="dxa"/>
             </w:tcMar>
@@ -1171,17 +1310,17 @@
               <w:rPr>
                 <w:sz w:val="17"/>
               </w:rPr>
-              <w:t>Cuentas clave institucionales de máxima fidelidad</w:t>
+              <w:t>Clientes de menudeo o medio mayoreo que compran rollos cerrados</w:t>
             </w:r>
           </w:p>
         </w:tc>
         <w:tc>
           <w:tcPr>
-            <w:tcW w:type="dxa" w:w="2592"/>
+            <w:tcW w:type="dxa" w:w="2412"/>
             <w:shd w:fill="FFFFFF"/>
             <w:tcMar>
-              <w:top w:w="50" w:type="dxa"/>
-              <w:bottom w:w="50" w:type="dxa"/>
+              <w:top w:w="60" w:type="dxa"/>
+              <w:bottom w:w="60" w:type="dxa"/>
               <w:left w:w="80" w:type="dxa"/>
               <w:right w:w="80" w:type="dxa"/>
             </w:tcMar>
@@ -1191,7 +1330,7 @@
               <w:rPr>
                 <w:sz w:val="17"/>
               </w:rPr>
-              <w:t>Asignación Estándar (Perfilada al alta)</w:t>
+              <w:t>Asignación Estándar (Sin aprobación)</w:t>
             </w:r>
           </w:p>
         </w:tc>
@@ -1199,11 +1338,11 @@
       <w:tr>
         <w:tc>
           <w:tcPr>
-            <w:tcW w:type="dxa" w:w="1152"/>
+            <w:tcW w:type="dxa" w:w="2412"/>
             <w:shd w:fill="F8FAFC"/>
             <w:tcMar>
-              <w:top w:w="50" w:type="dxa"/>
-              <w:bottom w:w="50" w:type="dxa"/>
+              <w:top w:w="60" w:type="dxa"/>
+              <w:bottom w:w="60" w:type="dxa"/>
               <w:left w:w="80" w:type="dxa"/>
               <w:right w:w="80" w:type="dxa"/>
             </w:tcMar>
@@ -1220,11 +1359,11 @@
         </w:tc>
         <w:tc>
           <w:tcPr>
-            <w:tcW w:type="dxa" w:w="2592"/>
+            <w:tcW w:type="dxa" w:w="2412"/>
             <w:shd w:fill="F8FAFC"/>
             <w:tcMar>
-              <w:top w:w="50" w:type="dxa"/>
-              <w:bottom w:w="50" w:type="dxa"/>
+              <w:top w:w="60" w:type="dxa"/>
+              <w:bottom w:w="60" w:type="dxa"/>
               <w:left w:w="80" w:type="dxa"/>
               <w:right w:w="80" w:type="dxa"/>
             </w:tcMar>
@@ -1234,17 +1373,17 @@
               <w:rPr>
                 <w:sz w:val="17"/>
               </w:rPr>
-              <w:t>Precio Dirección / Mayorista</w:t>
+              <w:t>Mega Mayorista</w:t>
             </w:r>
           </w:p>
         </w:tc>
         <w:tc>
           <w:tcPr>
-            <w:tcW w:type="dxa" w:w="3312"/>
+            <w:tcW w:type="dxa" w:w="2412"/>
             <w:shd w:fill="F8FAFC"/>
             <w:tcMar>
-              <w:top w:w="50" w:type="dxa"/>
-              <w:bottom w:w="50" w:type="dxa"/>
+              <w:top w:w="60" w:type="dxa"/>
+              <w:bottom w:w="60" w:type="dxa"/>
               <w:left w:w="80" w:type="dxa"/>
               <w:right w:w="80" w:type="dxa"/>
             </w:tcMar>
@@ -1254,17 +1393,17 @@
               <w:rPr>
                 <w:sz w:val="17"/>
               </w:rPr>
-              <w:t>Negociaciones directas de volumen excepcional</w:t>
+              <w:t>Cuentas estratégicas de máximo volumen de compra</w:t>
             </w:r>
           </w:p>
         </w:tc>
         <w:tc>
           <w:tcPr>
-            <w:tcW w:type="dxa" w:w="2592"/>
-            <w:shd w:fill="F8FAFC"/>
+            <w:tcW w:type="dxa" w:w="2412"/>
+            <w:shd w:fill="FEF3C7"/>
             <w:tcMar>
-              <w:top w:w="50" w:type="dxa"/>
-              <w:bottom w:w="50" w:type="dxa"/>
+              <w:top w:w="60" w:type="dxa"/>
+              <w:bottom w:w="60" w:type="dxa"/>
               <w:left w:w="80" w:type="dxa"/>
               <w:right w:w="80" w:type="dxa"/>
             </w:tcMar>
@@ -1273,10 +1412,10 @@
             <w:r>
               <w:rPr>
                 <w:b/>
-                <w:color w:val="B91C1C"/>
+                <w:color w:val="92400E"/>
                 <w:sz w:val="17"/>
               </w:rPr>
-              <w:t>REQUIERE AUTORIZACIÓN DE DIRECCIÓN / ALMA</w:t>
+              <w:t>REQUIERE APROBACIÓN DIRECCIÓN GENERAL 🔒</w:t>
             </w:r>
           </w:p>
         </w:tc>
@@ -1284,11 +1423,11 @@
       <w:tr>
         <w:tc>
           <w:tcPr>
-            <w:tcW w:type="dxa" w:w="1152"/>
+            <w:tcW w:type="dxa" w:w="2412"/>
             <w:shd w:fill="FFFFFF"/>
             <w:tcMar>
-              <w:top w:w="50" w:type="dxa"/>
-              <w:bottom w:w="50" w:type="dxa"/>
+              <w:top w:w="60" w:type="dxa"/>
+              <w:bottom w:w="60" w:type="dxa"/>
               <w:left w:w="80" w:type="dxa"/>
               <w:right w:w="80" w:type="dxa"/>
             </w:tcMar>
@@ -1305,11 +1444,11 @@
         </w:tc>
         <w:tc>
           <w:tcPr>
-            <w:tcW w:type="dxa" w:w="2592"/>
+            <w:tcW w:type="dxa" w:w="2412"/>
             <w:shd w:fill="FFFFFF"/>
             <w:tcMar>
-              <w:top w:w="50" w:type="dxa"/>
-              <w:bottom w:w="50" w:type="dxa"/>
+              <w:top w:w="60" w:type="dxa"/>
+              <w:bottom w:w="60" w:type="dxa"/>
               <w:left w:w="80" w:type="dxa"/>
               <w:right w:w="80" w:type="dxa"/>
             </w:tcMar>
@@ -1319,17 +1458,17 @@
               <w:rPr>
                 <w:sz w:val="17"/>
               </w:rPr>
-              <w:t>Venta Web / Asesor Externo</w:t>
+              <w:t>Venta Web / Catálogo Especial</w:t>
             </w:r>
           </w:p>
         </w:tc>
         <w:tc>
           <w:tcPr>
-            <w:tcW w:type="dxa" w:w="3312"/>
+            <w:tcW w:type="dxa" w:w="2412"/>
             <w:shd w:fill="FFFFFF"/>
             <w:tcMar>
-              <w:top w:w="50" w:type="dxa"/>
-              <w:bottom w:w="50" w:type="dxa"/>
+              <w:top w:w="60" w:type="dxa"/>
+              <w:bottom w:w="60" w:type="dxa"/>
               <w:left w:w="80" w:type="dxa"/>
               <w:right w:w="80" w:type="dxa"/>
             </w:tcMar>
@@ -1339,17 +1478,17 @@
               <w:rPr>
                 <w:sz w:val="17"/>
               </w:rPr>
-              <w:t>Público general y asesores digitales externos</w:t>
+              <w:t>Compradores en línea vía portal web / Shopify</w:t>
             </w:r>
           </w:p>
         </w:tc>
         <w:tc>
           <w:tcPr>
-            <w:tcW w:type="dxa" w:w="2592"/>
+            <w:tcW w:type="dxa" w:w="2412"/>
             <w:shd w:fill="FFFFFF"/>
             <w:tcMar>
-              <w:top w:w="50" w:type="dxa"/>
-              <w:bottom w:w="50" w:type="dxa"/>
+              <w:top w:w="60" w:type="dxa"/>
+              <w:bottom w:w="60" w:type="dxa"/>
               <w:left w:w="80" w:type="dxa"/>
               <w:right w:w="80" w:type="dxa"/>
             </w:tcMar>
@@ -1359,7 +1498,7 @@
               <w:rPr>
                 <w:sz w:val="17"/>
               </w:rPr>
-              <w:t>Asignación Estándar Web (Marketing)</w:t>
+              <w:t>Asignación Automática Sistema</w:t>
             </w:r>
           </w:p>
         </w:tc>
@@ -1367,192 +1506,536 @@
     </w:tbl>
     <w:p>
       <w:pPr>
-        <w:spacing w:after="120"/>
+        <w:keepNext/>
+        <w:spacing w:before="320" w:after="120"/>
       </w:pPr>
-    </w:p>
-    <w:p>
       <w:r>
-        <w:t>3.2. Candado de Modificación de Lista en Cotización:</w:t>
-        <w:br/>
-        <w:t>• Cada cliente tiene su lista de precios oficial precargada en su ficha de catálogo.</w:t>
-        <w:br/>
-        <w:t>• Si un agente comercial acuerda verbalmente con el cliente aplicar una lista más baja o una lista especial (ej. F5 en lugar de F1) para una cotización específica, el sistema BLOQUEA el guardado directo.</w:t>
-        <w:br/>
-        <w:t>• La cotización entra en estado 'REQUIERE_AUTORIZACION', notificando a la Supervisora de ATC (Alma). Únicamente tras la aprobación gerencial (registrando usuario, fecha, hora y motivo) la cotización podrá avanzar al flujo de cobro y surtido.</w:t>
+        <w:rPr>
+          <w:b/>
+          <w:color w:val="3730A3"/>
+          <w:sz w:val="28"/>
+        </w:rPr>
+        <w:t>4. Regla de Negocio 3: Matriz de Precios Especiales por Cliente y SKU</w:t>
       </w:r>
     </w:p>
     <w:p>
       <w:pPr>
-        <w:pStyle w:val="Heading1"/>
-        <w:spacing w:before="280"/>
+        <w:pStyle w:val="ListBullet"/>
+        <w:spacing w:before="20" w:after="60"/>
       </w:pPr>
       <w:r>
         <w:rPr>
-          <w:color w:val="1E293B"/>
+          <w:b/>
+          <w:color w:val="0F172A"/>
         </w:rPr>
-        <w:t>4. Regla de Negocio 3: Privacidad y Confidencialidad de Márgenes</w:t>
+        <w:t xml:space="preserve">Acuerdos Directivos: </w:t>
+      </w:r>
+      <w:r>
+        <w:t>Ciertos clientes cuentan con precios pactados por metro para telas específicas mediante acuerdos comerciales de Dirección General.</w:t>
+      </w:r>
+    </w:p>
+    <w:p>
+      <w:pPr>
+        <w:pStyle w:val="ListBullet"/>
+        <w:spacing w:before="20" w:after="60"/>
+      </w:pPr>
+      <w:r>
+        <w:rPr>
+          <w:b/>
+          <w:color w:val="0F172A"/>
+        </w:rPr>
+        <w:t xml:space="preserve">Prioridad Absoluta: </w:t>
+      </w:r>
+      <w:r>
+        <w:t>Si existe un precio especial registrado, el sistema bloquea y anula cualquier lista base, aplicando automáticamente el precio pactado.</w:t>
+      </w:r>
+    </w:p>
+    <w:p>
+      <w:pPr>
+        <w:pStyle w:val="ListBullet"/>
+        <w:spacing w:before="20" w:after="60"/>
+      </w:pPr>
+      <w:r>
+        <w:rPr>
+          <w:b/>
+          <w:color w:val="0F172A"/>
+        </w:rPr>
+        <w:t xml:space="preserve">Candado de Integridad: </w:t>
+      </w:r>
+      <w:r>
+        <w:t>Los precios especiales están precargados y bloqueados en pantalla para evitar alteraciones manuales que provoquen pérdidas comerciales.</w:t>
+      </w:r>
+    </w:p>
+    <w:p>
+      <w:pPr>
+        <w:keepNext/>
+        <w:spacing w:before="320" w:after="120"/>
+      </w:pPr>
+      <w:r>
+        <w:rPr>
+          <w:b/>
+          <w:color w:val="3730A3"/>
+          <w:sz w:val="28"/>
+        </w:rPr>
+        <w:t>5. Regla de Negocio 4 y 5: Tarifario Diferenciado Rollo vs. Corte y Ventana de Apartado</w:t>
+      </w:r>
+    </w:p>
+    <w:p>
+      <w:pPr>
+        <w:pStyle w:val="ListBullet"/>
+        <w:spacing w:before="20" w:after="60"/>
+      </w:pPr>
+      <w:r>
+        <w:rPr>
+          <w:b/>
+          <w:color w:val="0F172A"/>
+        </w:rPr>
+        <w:t xml:space="preserve">Diferencial Rollo vs. Corte: </w:t>
+      </w:r>
+      <w:r>
+        <w:t>La compra por corte implica una tarifa superior al rollo completo debido al costo operativo de desenrollado, mesa de corte y mermas.</w:t>
+      </w:r>
+    </w:p>
+    <w:p>
+      <w:pPr>
+        <w:pStyle w:val="ListBullet"/>
+        <w:spacing w:before="20" w:after="60"/>
+      </w:pPr>
+      <w:r>
+        <w:rPr>
+          <w:b/>
+          <w:color w:val="0F172A"/>
+        </w:rPr>
+        <w:t xml:space="preserve">Ventana de Apartado Comercial (24 Horas): </w:t>
+      </w:r>
+      <w:r>
+        <w:t>El apartado preventivo reservado por un cliente vence automáticamente a las 24 horas si no presenta comprobante de pago o confirmación de crédito.</w:t>
+      </w:r>
+    </w:p>
+    <w:p>
+      <w:pPr>
+        <w:pStyle w:val="ListBullet"/>
+        <w:spacing w:before="20" w:after="60"/>
+      </w:pPr>
+      <w:r>
+        <w:rPr>
+          <w:b/>
+          <w:color w:val="0F172A"/>
+        </w:rPr>
+        <w:t xml:space="preserve">Apartado Operativo en Almacén (72 Horas): </w:t>
+      </w:r>
+      <w:r>
+        <w:t>Los pedidos empacados y listos en piso de almacén cuentan con un resguardo máximo de 72 horas antes de liberarse a stock disponible.</w:t>
+      </w:r>
+    </w:p>
+    <w:p>
+      <w:pPr>
+        <w:keepNext/>
+        <w:spacing w:before="320" w:after="120"/>
+      </w:pPr>
+      <w:r>
+        <w:rPr>
+          <w:b/>
+          <w:color w:val="3730A3"/>
+          <w:sz w:val="28"/>
+        </w:rPr>
+        <w:t>6. Regla de Negocio 6 y 7: Validación Logística y Motor de Backorders FIFO Marítimo</w:t>
+      </w:r>
+    </w:p>
+    <w:p>
+      <w:pPr>
+        <w:pStyle w:val="ListBullet"/>
+        <w:spacing w:before="20" w:after="60"/>
+      </w:pPr>
+      <w:r>
+        <w:rPr>
+          <w:b/>
+          <w:color w:val="0F172A"/>
+        </w:rPr>
+        <w:t xml:space="preserve">Tarea Preventiva en EN_SURTIDO: </w:t>
+      </w:r>
+      <w:r>
+        <w:t>Al pasar a EN_SURTIDO, el sistema asigna tarea automática a ATC para revalidar domicilio, receptor, teléfono directo y fletera antes del embalaje.</w:t>
+      </w:r>
+    </w:p>
+    <w:p>
+      <w:pPr>
+        <w:pStyle w:val="ListBullet"/>
+        <w:spacing w:before="20" w:after="60"/>
+      </w:pPr>
+      <w:r>
+        <w:rPr>
+          <w:b/>
+          <w:color w:val="0F172A"/>
+        </w:rPr>
+        <w:t xml:space="preserve">Backorders Marítimos (FIFO): </w:t>
+      </w:r>
+      <w:r>
+        <w:t>Pedidos sobre rollos en tránsito marítimo asignan número de contenedor, fecha y orden FIFO estricto.</w:t>
+      </w:r>
+    </w:p>
+    <w:p>
+      <w:pPr>
+        <w:pStyle w:val="ListBullet"/>
+        <w:spacing w:before="20" w:after="60"/>
+      </w:pPr>
+      <w:r>
+        <w:rPr>
+          <w:b/>
+          <w:color w:val="0F172A"/>
+        </w:rPr>
+        <w:t xml:space="preserve">Semáforos Preventivos: </w:t>
+      </w:r>
+      <w:r>
+        <w:t>Alerta a 15 días (revalidar OC) y a 5 días (preparar liquidación, CFDI 4.0 y patio de corte). Desistimientos recorren la cola automáticamente en cascada.</w:t>
+      </w:r>
+    </w:p>
+    <w:p>
+      <w:pPr>
+        <w:keepNext/>
+        <w:spacing w:before="320" w:after="120"/>
+      </w:pPr>
+      <w:r>
+        <w:rPr>
+          <w:b/>
+          <w:color w:val="3730A3"/>
+          <w:sz w:val="28"/>
+        </w:rPr>
+        <w:t>7. Reglas de Negocio Derivadas de la Sesión #2 (21 de Octubre de 2026)</w:t>
+      </w:r>
+    </w:p>
+    <w:p>
+      <w:pPr>
+        <w:keepNext/>
+        <w:spacing w:before="240" w:after="80"/>
+      </w:pPr>
+      <w:r>
+        <w:rPr>
+          <w:b/>
+          <w:color w:val="0F172A"/>
+          <w:sz w:val="24"/>
+        </w:rPr>
+        <w:t>7.1. Regla 8: Matriz de Días y Horarios de Entrega por Cliente &amp; Retención en Bodega</w:t>
       </w:r>
     </w:p>
     <w:p>
       <w:r>
-        <w:t>4.1. Ocultamiento de Porcentajes de Comisión para Perfiles Operativos:</w:t>
-        <w:br/>
-        <w:t>• Durante la revisión del prototipo se identificó que aparecían etiquetas con porcentajes internos (ej. 'F2 — Estándar (2.25%)').</w:t>
-        <w:br/>
-        <w:t>• Queda formalmente estipulado que las chicas de Atención al Cliente y los agentes de ventas de calle NO DEBEN VER bajo ninguna circunstancia el desglose de comisiones ni los porcentajes de margen bruto de Formatex.</w:t>
-        <w:br/>
-        <w:t>• En la pantalla de cotización, el operador únicamente visualizará el precio final unitario por metro ($/m) resultante.</w:t>
-        <w:br/>
-        <w:t>• La visibilidad de márgenes, costos base y comisiones de agentes queda restringida exclusivamente a los roles 'ADMIN' y 'GERENCIA'.</w:t>
+        <w:t>Los clientes de mayoreo y talleres externos reciben mercancía únicamente en días fijos acordados (ej. Martes y Jueves) y en ventanas horarias específicas (ej. 09:00 a 14:00 hrs). El sistema incorpora selectores de días permitidos ([Lun] [Mar] [Mié] [Jue] [Vie] [Sáb]) y horarios de recepción en el catálogo de clientes.</w:t>
+      </w:r>
+    </w:p>
+    <w:tbl>
+      <w:tblPr>
+        <w:tblW w:type="auto" w:w="0"/>
+        <w:jc w:val="center"/>
+        <w:tblLook w:firstColumn="1" w:firstRow="1" w:lastColumn="0" w:lastRow="0" w:noHBand="0" w:noVBand="1" w:val="04A0"/>
+      </w:tblPr>
+      <w:tblGrid>
+        <w:gridCol w:w="9648"/>
+      </w:tblGrid>
+      <w:tr>
+        <w:tc>
+          <w:tcPr>
+            <w:tcW w:type="dxa" w:w="9648"/>
+            <w:shd w:fill="EFF6FF"/>
+            <w:tcMar>
+              <w:top w:w="100" w:type="dxa"/>
+              <w:bottom w:w="100" w:type="dxa"/>
+              <w:left w:w="140" w:type="dxa"/>
+              <w:right w:w="140" w:type="dxa"/>
+            </w:tcMar>
+          </w:tcPr>
+          <w:p>
+            <w:pPr>
+              <w:spacing w:after="40"/>
+            </w:pPr>
+            <w:r>
+              <w:rPr>
+                <w:b/>
+                <w:color w:val="3730A3"/>
+                <w:sz w:val="19"/>
+              </w:rPr>
+              <w:t xml:space="preserve">CANDADO DE RETENCIÓN FÍSICA EN BODEGA: </w:t>
+            </w:r>
+            <w:r>
+              <w:rPr>
+                <w:color w:val="1E3A8A"/>
+                <w:sz w:val="19"/>
+              </w:rPr>
+              <w:t>Si un pedido concluye su corte, empaque y facturación un día que no coincide con los días autorizados de recepción del cliente, el WMS PROHÍBE subir el bulto a ruta. El pedido permanece retenido físicamente en estado 'Bodega en Espera de Ruta' hasta la mañana del día autorizado, evitando fletes falsos y rechazos en rampa.</w:t>
+            </w:r>
+          </w:p>
+        </w:tc>
+      </w:tr>
+    </w:tbl>
+    <w:p>
+      <w:pPr>
+        <w:spacing w:after="80"/>
+      </w:pPr>
+    </w:p>
+    <w:p>
+      <w:pPr>
+        <w:keepNext/>
+        <w:spacing w:before="240" w:after="80"/>
+      </w:pPr>
+      <w:r>
+        <w:rPr>
+          <w:b/>
+          <w:color w:val="0F172A"/>
+          <w:sz w:val="24"/>
+        </w:rPr>
+        <w:t>7.2. Regla 9: Flota Propia de Formatex (8 Camionetas) y Rutas Programadas (Drive In)</w:t>
       </w:r>
     </w:p>
     <w:p>
       <w:pPr>
-        <w:pStyle w:val="Heading1"/>
-        <w:spacing w:before="280"/>
+        <w:pStyle w:val="ListBullet"/>
+        <w:spacing w:before="20" w:after="60"/>
       </w:pPr>
       <w:r>
         <w:rPr>
-          <w:color w:val="1E293B"/>
+          <w:b/>
+          <w:color w:val="0F172A"/>
         </w:rPr>
-        <w:t>5. Regla de Negocio 4: Matriz Centralizada de Precios Especiales</w:t>
+        <w:t xml:space="preserve">Flota Vehicular: </w:t>
+      </w:r>
+      <w:r>
+        <w:t>Formatex opera 8 camionetas propias para reparto metropolitano y regional, gestionadas en Drive In por Carla (Jefatura de Embarques).</w:t>
+      </w:r>
+    </w:p>
+    <w:p>
+      <w:pPr>
+        <w:pStyle w:val="ListBullet"/>
+        <w:spacing w:before="20" w:after="60"/>
+      </w:pPr>
+      <w:r>
+        <w:rPr>
+          <w:b/>
+          <w:color w:val="0F172A"/>
+        </w:rPr>
+        <w:t xml:space="preserve">Ruta Ocotlán (Martes y Jueves): </w:t>
+      </w:r>
+      <w:r>
+        <w:t>Ruta fija fuera de Guadalajara que opera exclusivamente los días Martes y Jueves. Pedidos concluidos el lunes tarde ya no alcanzan la logística del martes y se entregan obligatoriamente el jueves.</w:t>
+      </w:r>
+    </w:p>
+    <w:p>
+      <w:pPr>
+        <w:pStyle w:val="ListBullet"/>
+        <w:spacing w:before="20" w:after="60"/>
+      </w:pPr>
+      <w:r>
+        <w:rPr>
+          <w:b/>
+          <w:color w:val="0F172A"/>
+        </w:rPr>
+        <w:t xml:space="preserve">Sincronización ATC: </w:t>
+      </w:r>
+      <w:r>
+        <w:t>ATC se guía por el semáforo de rutas programadas para no prometer fechas de entrega incompatibles con la logística de reparto.</w:t>
+      </w:r>
+    </w:p>
+    <w:p>
+      <w:pPr>
+        <w:keepNext/>
+        <w:spacing w:before="240" w:after="80"/>
+      </w:pPr>
+      <w:r>
+        <w:rPr>
+          <w:b/>
+          <w:color w:val="0F172A"/>
+          <w:sz w:val="24"/>
+        </w:rPr>
+        <w:t>7.3. Regla 10: Canal E-Commerce Web (Shopify / Nayeli / Lista F10)</w:t>
+      </w:r>
+    </w:p>
+    <w:p>
+      <w:pPr>
+        <w:pStyle w:val="ListBullet"/>
+        <w:spacing w:before="20" w:after="60"/>
+      </w:pPr>
+      <w:r>
+        <w:rPr>
+          <w:b/>
+          <w:color w:val="0F172A"/>
+        </w:rPr>
+        <w:t xml:space="preserve">Operación Minorista: </w:t>
+      </w:r>
+      <w:r>
+        <w:t>Ventas en una sola exhibición sin crédito mercantil, gestionadas por Nayeli vía Shopify.</w:t>
+      </w:r>
+    </w:p>
+    <w:p>
+      <w:pPr>
+        <w:pStyle w:val="ListBullet"/>
+        <w:spacing w:before="20" w:after="60"/>
+      </w:pPr>
+      <w:r>
+        <w:rPr>
+          <w:b/>
+          <w:color w:val="0F172A"/>
+        </w:rPr>
+        <w:t xml:space="preserve">Lista F10: </w:t>
+      </w:r>
+      <w:r>
+        <w:t>Liquidación bajo lista oficial F10. Confirmado el pago bancario, se canaliza al almacén para surtido inmediato.</w:t>
+      </w:r>
+    </w:p>
+    <w:p>
+      <w:pPr>
+        <w:pStyle w:val="ListBullet"/>
+        <w:spacing w:before="20" w:after="60"/>
+      </w:pPr>
+      <w:r>
+        <w:rPr>
+          <w:b/>
+          <w:color w:val="0F172A"/>
+        </w:rPr>
+        <w:t xml:space="preserve">Envíos: </w:t>
+      </w:r>
+      <w:r>
+        <w:t>Nacionales con guías prepagadas; envíos internacionales excepcionales (ej. Colombia / Medellín) requieren cotización directa de flete con Luis Javier.</w:t>
+      </w:r>
+    </w:p>
+    <w:p>
+      <w:pPr>
+        <w:keepNext/>
+        <w:spacing w:before="240" w:after="80"/>
+      </w:pPr>
+      <w:r>
+        <w:rPr>
+          <w:b/>
+          <w:color w:val="0F172A"/>
+          <w:sz w:val="24"/>
+        </w:rPr>
+        <w:t>7.4. Regla 11: Tratamiento de Muestras como Producto Terminado por Pieza (PZA)</w:t>
+      </w:r>
+    </w:p>
+    <w:p>
+      <w:pPr>
+        <w:pStyle w:val="ListBullet"/>
+        <w:spacing w:before="20" w:after="60"/>
+      </w:pPr>
+      <w:r>
+        <w:rPr>
+          <w:b/>
+          <w:color w:val="0F172A"/>
+        </w:rPr>
+        <w:t xml:space="preserve">Unidad de Medida PZA: </w:t>
+      </w:r>
+      <w:r>
+        <w:t>Los muestrarios, carpetas de colección y libros de telas son productos terminados registrados en unidades/piezas.</w:t>
+      </w:r>
+    </w:p>
+    <w:p>
+      <w:pPr>
+        <w:pStyle w:val="ListBullet"/>
+        <w:spacing w:before="20" w:after="60"/>
+      </w:pPr>
+      <w:r>
+        <w:rPr>
+          <w:b/>
+          <w:color w:val="0F172A"/>
+        </w:rPr>
+        <w:t xml:space="preserve">Sin Proceso de Corte: </w:t>
+      </w:r>
+      <w:r>
+        <w:t>No generan mermas ni requieren cálculo de corte en rollos. El precio se liquida unitariamente por pieza ($/PZA).</w:t>
+      </w:r>
+    </w:p>
+    <w:p>
+      <w:pPr>
+        <w:keepNext/>
+        <w:spacing w:before="240" w:after="80"/>
+      </w:pPr>
+      <w:r>
+        <w:rPr>
+          <w:b/>
+          <w:color w:val="0F172A"/>
+          <w:sz w:val="24"/>
+        </w:rPr>
+        <w:t>7.5. Regla 12: Traspasos Inter-Compañía Digitales Telares y Tejidos (TNT) ↔ Formatex</w:t>
       </w:r>
     </w:p>
     <w:p>
       <w:r>
-        <w:t>5.1. Problemática Operativa Actual Identificada:</w:t>
-        <w:br/>
-        <w:t>• Dirección General pacta con frecuencia precios especiales para proyectos específicos (ejemplo: telas que entran a piso de exhibición de cadenas como Muebles Plasencia, cuya compra se canaliza mediante múltiples talleres tapiceros terceros).</w:t>
-        <w:br/>
-        <w:t>• En la actualidad, dichos precios se anotan en un archivo de Excel manual que las asesoras deben consultar de memoria. Cuando una asesora olvida consultar el Excel, cotiza a precio de lista regular, generando disputas con el cliente y la consecuente emisión de Notas de Crédito que impactan la contabilidad y cobranza.</w:t>
-        <w:br/>
-        <w:br/>
-        <w:t>5.2. Solución Sistémica en el WMS 360°:</w:t>
-        <w:br/>
-        <w:t>• Se crea la entidad 'ClientSpecialPrice' en la base de datos centralizada de Formatex.</w:t>
-        <w:br/>
-        <w:t>• Cada precio pactado se vincula al Cliente y a la Tela (SKU), con su precio neto por metro ($/m), referencia del proyecto (ej. 'Plasencia') y vigencia temporal.</w:t>
-        <w:br/>
-        <w:t>• Auto-Detección y Cero Captura Manual: Al momento de seleccionar el cliente y agregar la tela en la cotización, el WMS consulta automáticamente la matriz. Si existe precio pactado vigente, lo inyecta en el renglón, bloquea la edición del precio para evitar errores de dedo y muestra un distintivo institucional de 'Precio Especial Pactado'.</w:t>
+        <w:t>Telares y Tejidos (TNT) y Formatex pertenecen al mismo propietario ('se pagan y se dan el vuelto'). Telares opera como importadora y custodia de inventario en bodegas cercanas (Río Tototlán / Rensselaer). El traspaso diario de rollos sustituye el flujo informal de capturas de WhatsApp por un Módulo de Solicitud Digital de Traspaso con folio oficial y bitácora de auditoría completa.</w:t>
       </w:r>
     </w:p>
     <w:p>
       <w:pPr>
-        <w:pStyle w:val="Heading1"/>
-        <w:spacing w:before="280"/>
+        <w:keepNext/>
+        <w:spacing w:before="240" w:after="80"/>
       </w:pPr>
       <w:r>
         <w:rPr>
-          <w:color w:val="1E293B"/>
+          <w:b/>
+          <w:color w:val="0F172A"/>
+          <w:sz w:val="24"/>
         </w:rPr>
-        <w:t>6. Regla de Negocio 5: Políticas de Apartado y Retención de Inventario</w:t>
+        <w:t>7.6. Regla 13: Bloqueo Estricto de Precios Especiales y Listas Asignadas</w:t>
       </w:r>
     </w:p>
+    <w:tbl>
+      <w:tblPr>
+        <w:tblW w:type="auto" w:w="0"/>
+        <w:jc w:val="center"/>
+        <w:tblLook w:firstColumn="1" w:firstRow="1" w:lastColumn="0" w:lastRow="0" w:noHBand="0" w:noVBand="1" w:val="04A0"/>
+      </w:tblPr>
+      <w:tblGrid>
+        <w:gridCol w:w="9648"/>
+      </w:tblGrid>
+      <w:tr>
+        <w:tc>
+          <w:tcPr>
+            <w:tcW w:type="dxa" w:w="9648"/>
+            <w:shd w:fill="EFF6FF"/>
+            <w:tcMar>
+              <w:top w:w="100" w:type="dxa"/>
+              <w:bottom w:w="100" w:type="dxa"/>
+              <w:left w:w="140" w:type="dxa"/>
+              <w:right w:w="140" w:type="dxa"/>
+            </w:tcMar>
+          </w:tcPr>
+          <w:p>
+            <w:pPr>
+              <w:spacing w:after="40"/>
+            </w:pPr>
+            <w:r>
+              <w:rPr>
+                <w:b/>
+                <w:color w:val="3730A3"/>
+                <w:sz w:val="19"/>
+              </w:rPr>
+              <w:t xml:space="preserve">CANDADO DE INTEGRIDAD COMERCIAL: </w:t>
+            </w:r>
+            <w:r>
+              <w:rPr>
+                <w:color w:val="1E3A8A"/>
+                <w:sz w:val="19"/>
+              </w:rPr>
+              <w:t>Se prohíbe la modificación manual del precio unitario por parte de los agentes comerciales al capturar pedidos. Los precios quedan estrictamente bloqueados según la lista oficial asignada o el convenio de precio especial directivo, blindando a Formatex contra errores operativos y pérdidas comerciales involuntarias.</w:t>
+            </w:r>
+          </w:p>
+        </w:tc>
+      </w:tr>
+    </w:tbl>
     <w:p>
-      <w:r>
-        <w:t>6.1. Adopción del Término 'Apartado':</w:t>
-        <w:br/>
-        <w:t>Se elimina en toda la interfaz de usuario el concepto técnico de 'Reserva Blanda' y se sustituye oficialmente por el término comercial 'Apartado', familiar para todo el personal de ventas y almacén.</w:t>
-        <w:br/>
-        <w:br/>
-        <w:t>6.2. La Regla de la Doble Ventana de Tiempo (24h Comercial vs. 72h Almacén):</w:t>
-        <w:br/>
-        <w:t>• Ventana Comercial Externa (24 Horas): Hacia el cliente, tanto en la cotización como en las comunicaciones verbales, se estipula que el apartado de los rollos tiene una vigencia estricta de 24 horas para generar sentido de urgencia en el pago y acelerar el ciclo de venta.</w:t>
-        <w:br/>
-        <w:t>• Ventana Operativa Interna (72 Horas / 3 Días): En la realidad de negocio, los clientes corporativos difícilmente pagan en 24 horas debido a sus calendarios internos de tesorería (concentrados usualmente los días viernes). Por ello, el sistema internamente en almacén retiene y protege los rollos apartados durante 72 horas antes de liberarlos de nuevo al inventario general.</w:t>
-        <w:br/>
-        <w:t>• Se eliminan del sistema las opciones de 7 días (168h) y 14 días (336h) por considerarse lesivas para la rotación de bodega.</w:t>
-      </w:r>
+      <w:pPr>
+        <w:spacing w:after="80"/>
+      </w:pPr>
     </w:p>
     <w:p>
       <w:pPr>
-        <w:pStyle w:val="Heading1"/>
-        <w:spacing w:before="280"/>
+        <w:keepNext/>
+        <w:spacing w:before="320" w:after="120"/>
       </w:pPr>
       <w:r>
         <w:rPr>
-          <w:color w:val="1E293B"/>
+          <w:b/>
+          <w:color w:val="3730A3"/>
+          <w:sz w:val="28"/>
         </w:rPr>
-        <w:t>7. Regla de Negocio 6: Logística de Entrega y Tarea de Validación</w:t>
-      </w:r>
-    </w:p>
-    <w:p>
-      <w:r>
-        <w:t>7.1. Selección de Destino al Cotizar:</w:t>
-        <w:br/>
-        <w:t>Al iniciar una cotización, ATC puede seleccionar el domicilio de entrega a partir de las sucursales precargadas del cliente, o bien dejarlo predeterminado a su domicilio fiscal.</w:t>
-        <w:br/>
-        <w:br/>
-        <w:t>7.2. El Gatillo Operativo: Confirmación Obligatoria en Surtido:</w:t>
-        <w:br/>
-        <w:t>• Dado que entre la cotización, el pago y la preparación física pueden transcurrir varios días, el cliente con frecuencia modifica el destino final de los rollos o designa a un nuevo chofer/receptor.</w:t>
-        <w:br/>
-        <w:t>• Decisión de Diseño consensuada con Andrea y Alma: La confirmación final NO debe postergarse hasta el empaque (cuando los rollos ya están embalados y rotulados), sino que se dispara de forma preventiva al momento en que el pedido entra a 'EN_SURTIDO'.</w:t>
-        <w:br/>
-        <w:t>• El sistema genera una tarea prioritaria asignada a la asesora de ATC creadora del pedido (y visible en el panel de supervisión de Alma) para validar y asegurar: domicilio exacto de entrega, nombre completo del receptor en sitio, teléfono celular directo, horario de descarga permitido en el taller, fletera seleccionada (Castores, Tres Guerras, Chofer Formatex, etc.) y ratificación de seguro contratado.</w:t>
-        <w:br/>
-        <w:t>• Dicha información se plasma en la Hoja de Embarque y Pase de Salida para que el chofer cuente con todos los datos de contacto al llegar a destino.</w:t>
-      </w:r>
-    </w:p>
-    <w:p>
-      <w:pPr>
-        <w:pStyle w:val="Heading1"/>
-        <w:spacing w:before="280"/>
-      </w:pPr>
-      <w:r>
-        <w:rPr>
-          <w:color w:val="1E293B"/>
-        </w:rPr>
-        <w:t>8. Regla de Negocio 7: Motor de Backorder y Cola FIFO de Asignación</w:t>
-      </w:r>
-    </w:p>
-    <w:p>
-      <w:r>
-        <w:t>8.1. Definición Operativa de Backorder:</w:t>
-        <w:br/>
-        <w:t>Aplica para aquellos pedidos donde Formatex no cuenta con existencia física inmediata en su bodega principal de Guadalajara, pero la tela se encuentra en tránsito marítimo (embarque en contenedor) o programada en la bodega de telares.</w:t>
-        <w:br/>
-        <w:br/>
-        <w:t>8.2. Identificación del Embarque:</w:t>
-        <w:br/>
-        <w:t>Todo pedido en backorder debe registrar obligatoriamente: Número de Contenedor (ej. MSCU-829104-1), Fecha de Captura del Pedido y Fecha Estimada de Arribo (ETA) del contenedor a bodega.</w:t>
-        <w:br/>
-        <w:br/>
-        <w:t>8.3. Los Tres Formatos Comerciales de Cotización y Cobro en Backorder:</w:t>
-        <w:br/>
-        <w:t xml:space="preserve">  1. Contado con Anticipo: El cliente realiza un pago adelantado para congelar su metraje en el contenedor. Al arribar la mercancía, se mide el metraje real de los rollos y se ajusta la diferencia (saldo a favor o pago complementario).</w:t>
-        <w:br/>
-        <w:t xml:space="preserve">  2. Contado al Arribo (Cierre Fiscal): El cliente queda formado en la cola de espera sin desembolso previo, con el acuerdo de que se le factura y liquida en el mismo mes calendario en que el contenedor arriba a Formatex, satisfaciendo sus requisitos de deducibilidad fiscal.</w:t>
-        <w:br/>
-        <w:t xml:space="preserve">  3. Crédito Comercial: El cliente reserva su turno en cola y, al llegar la tela, se surte directamente contra su línea de crédito autorizada.</w:t>
-        <w:br/>
-        <w:br/>
-        <w:t>8.4. Reglas de Notificación Preventiva ATC (Semáforo de Arribo):</w:t>
-        <w:br/>
-        <w:t>• Alerta de 15 Días Previos al ETA (Semáforo Ámbar): El sistema alerta a Atención al Cliente para comunicarse telefónicamente o por WhatsApp con el cliente a fin de confirmar que la Orden de Compra sigue vigente y mantener reservado su lote de tela.</w:t>
-        <w:br/>
-        <w:t>• Alerta de 5 Días Previos al ETA (Semáforo Rojo): Se emite un aviso de arribo inminente para coordinar la liquidación del pedido, la emisión del CFDI y la preparación de las tarimas de corte o despacho en piso.</w:t>
-        <w:br/>
-        <w:br/>
-        <w:t>8.5. Recorrido Automático en Cascada de la Cola FIFO:</w:t>
-        <w:br/>
-        <w:t>• Los pedidos en backorder se ordenan rigurosamente por fecha/hora de registro (First-In, First-Out: Turno #1, #2, #3...).</w:t>
-        <w:br/>
-        <w:t>• En caso de que un cliente decline su pedido durante la llamada de los 15 días o cancele su orden, el sistema cancela el pedido y ejecuta de inmediato el recorrido automático de la cola (todos los turnos posteriores retroceden una posición: n - 1).</w:t>
-        <w:br/>
-        <w:t>• La tela liberada se ofrece al siguiente cliente en turno del contenedor o se promueve a pedidos formados en contenedores con arribos posteriores.</w:t>
-      </w:r>
-    </w:p>
-    <w:p>
-      <w:pPr>
-        <w:pStyle w:val="Heading1"/>
-        <w:spacing w:before="280"/>
-      </w:pPr>
-      <w:r>
-        <w:rPr>
-          <w:color w:val="1E293B"/>
-        </w:rPr>
-        <w:t>9. Matriz de Compromisos y Próximos Pasos (Checklist)</w:t>
+        <w:t>8. Matriz de Compromisos y Entregables Actualizada</w:t>
       </w:r>
     </w:p>
     <w:tbl>
@@ -1575,8 +2058,8 @@
             <w:tcMar>
               <w:top w:w="80" w:type="dxa"/>
               <w:bottom w:w="80" w:type="dxa"/>
-              <w:left w:w="90" w:type="dxa"/>
-              <w:right w:w="90" w:type="dxa"/>
+              <w:left w:w="100" w:type="dxa"/>
+              <w:right w:w="100" w:type="dxa"/>
             </w:tcMar>
           </w:tcPr>
           <w:p>
@@ -1584,7 +2067,7 @@
               <w:rPr>
                 <w:b/>
                 <w:color w:val="FFFFFF"/>
-                <w:sz w:val="17"/>
+                <w:sz w:val="18"/>
               </w:rPr>
               <w:t>Responsable</w:t>
             </w:r>
@@ -1597,8 +2080,8 @@
             <w:tcMar>
               <w:top w:w="80" w:type="dxa"/>
               <w:bottom w:w="80" w:type="dxa"/>
-              <w:left w:w="90" w:type="dxa"/>
-              <w:right w:w="90" w:type="dxa"/>
+              <w:left w:w="100" w:type="dxa"/>
+              <w:right w:w="100" w:type="dxa"/>
             </w:tcMar>
           </w:tcPr>
           <w:p>
@@ -1606,7 +2089,7 @@
               <w:rPr>
                 <w:b/>
                 <w:color w:val="FFFFFF"/>
-                <w:sz w:val="17"/>
+                <w:sz w:val="18"/>
               </w:rPr>
               <w:t>Entregable / Acción Acordada</w:t>
             </w:r>
@@ -1619,8 +2102,8 @@
             <w:tcMar>
               <w:top w:w="80" w:type="dxa"/>
               <w:bottom w:w="80" w:type="dxa"/>
-              <w:left w:w="90" w:type="dxa"/>
-              <w:right w:w="90" w:type="dxa"/>
+              <w:left w:w="100" w:type="dxa"/>
+              <w:right w:w="100" w:type="dxa"/>
             </w:tcMar>
           </w:tcPr>
           <w:p>
@@ -1628,9 +2111,9 @@
               <w:rPr>
                 <w:b/>
                 <w:color w:val="FFFFFF"/>
-                <w:sz w:val="17"/>
+                <w:sz w:val="18"/>
               </w:rPr>
-              <w:t>Fecha Compromiso / Estado</w:t>
+              <w:t>Estatus</w:t>
             </w:r>
           </w:p>
         </w:tc>
@@ -1638,11 +2121,11 @@
       <w:tr>
         <w:tc>
           <w:tcPr>
-            <w:tcW w:type="dxa" w:w="2880"/>
+            <w:tcW w:type="dxa" w:w="3216"/>
             <w:shd w:fill="F8FAFC"/>
             <w:tcMar>
-              <w:top w:w="50" w:type="dxa"/>
-              <w:bottom w:w="50" w:type="dxa"/>
+              <w:top w:w="60" w:type="dxa"/>
+              <w:bottom w:w="60" w:type="dxa"/>
               <w:left w:w="80" w:type="dxa"/>
               <w:right w:w="80" w:type="dxa"/>
             </w:tcMar>
@@ -1659,11 +2142,11 @@
         </w:tc>
         <w:tc>
           <w:tcPr>
-            <w:tcW w:type="dxa" w:w="4752"/>
+            <w:tcW w:type="dxa" w:w="3216"/>
             <w:shd w:fill="F8FAFC"/>
             <w:tcMar>
-              <w:top w:w="50" w:type="dxa"/>
-              <w:bottom w:w="50" w:type="dxa"/>
+              <w:top w:w="60" w:type="dxa"/>
+              <w:bottom w:w="60" w:type="dxa"/>
               <w:left w:w="80" w:type="dxa"/>
               <w:right w:w="80" w:type="dxa"/>
             </w:tcMar>
@@ -1673,17 +2156,17 @@
               <w:rPr>
                 <w:sz w:val="17"/>
               </w:rPr>
-              <w:t>Compartir documento y catálogo de las 10 listas de precios oficiales vigentes</w:t>
+              <w:t>Compartir catálogo detallado de las 10 listas de precios vigentes</w:t>
             </w:r>
           </w:p>
         </w:tc>
         <w:tc>
           <w:tcPr>
-            <w:tcW w:type="dxa" w:w="2016"/>
-            <w:shd w:fill="F8FAFC"/>
+            <w:tcW w:type="dxa" w:w="3216"/>
+            <w:shd w:fill="DCFCE7"/>
             <w:tcMar>
-              <w:top w:w="50" w:type="dxa"/>
-              <w:bottom w:w="50" w:type="dxa"/>
+              <w:top w:w="60" w:type="dxa"/>
+              <w:bottom w:w="60" w:type="dxa"/>
               <w:left w:w="80" w:type="dxa"/>
               <w:right w:w="80" w:type="dxa"/>
             </w:tcMar>
@@ -1691,9 +2174,11 @@
           <w:p>
             <w:r>
               <w:rPr>
+                <w:b/>
+                <w:color w:val="166534"/>
                 <w:sz w:val="17"/>
               </w:rPr>
-              <w:t>Semana 42 (Oct 2026) — Pendiente envío</w:t>
+              <w:t>COMPLETADO (12,386 precios ingeridos)</w:t>
             </w:r>
           </w:p>
         </w:tc>
@@ -1701,11 +2186,11 @@
       <w:tr>
         <w:tc>
           <w:tcPr>
-            <w:tcW w:type="dxa" w:w="2880"/>
+            <w:tcW w:type="dxa" w:w="3216"/>
             <w:shd w:fill="FFFFFF"/>
             <w:tcMar>
-              <w:top w:w="50" w:type="dxa"/>
-              <w:bottom w:w="50" w:type="dxa"/>
+              <w:top w:w="60" w:type="dxa"/>
+              <w:bottom w:w="60" w:type="dxa"/>
               <w:left w:w="80" w:type="dxa"/>
               <w:right w:w="80" w:type="dxa"/>
             </w:tcMar>
@@ -1722,11 +2207,11 @@
         </w:tc>
         <w:tc>
           <w:tcPr>
-            <w:tcW w:type="dxa" w:w="4752"/>
+            <w:tcW w:type="dxa" w:w="3216"/>
             <w:shd w:fill="FFFFFF"/>
             <w:tcMar>
-              <w:top w:w="50" w:type="dxa"/>
-              <w:bottom w:w="50" w:type="dxa"/>
+              <w:top w:w="60" w:type="dxa"/>
+              <w:bottom w:w="60" w:type="dxa"/>
               <w:left w:w="80" w:type="dxa"/>
               <w:right w:w="80" w:type="dxa"/>
             </w:tcMar>
@@ -1742,11 +2227,11 @@
         </w:tc>
         <w:tc>
           <w:tcPr>
-            <w:tcW w:type="dxa" w:w="2016"/>
-            <w:shd w:fill="FFFFFF"/>
+            <w:tcW w:type="dxa" w:w="3216"/>
+            <w:shd w:fill="DCFCE7"/>
             <w:tcMar>
-              <w:top w:w="50" w:type="dxa"/>
-              <w:bottom w:w="50" w:type="dxa"/>
+              <w:top w:w="60" w:type="dxa"/>
+              <w:bottom w:w="60" w:type="dxa"/>
               <w:left w:w="80" w:type="dxa"/>
               <w:right w:w="80" w:type="dxa"/>
             </w:tcMar>
@@ -1754,9 +2239,11 @@
           <w:p>
             <w:r>
               <w:rPr>
+                <w:b/>
+                <w:color w:val="166534"/>
                 <w:sz w:val="17"/>
               </w:rPr>
-              <w:t>Semana 42 (Oct 2026) — Pendiente envío</w:t>
+              <w:t>COMPLETADO (306 convenios ingeridos)</w:t>
             </w:r>
           </w:p>
         </w:tc>
@@ -1764,11 +2251,11 @@
       <w:tr>
         <w:tc>
           <w:tcPr>
-            <w:tcW w:type="dxa" w:w="2880"/>
+            <w:tcW w:type="dxa" w:w="3216"/>
             <w:shd w:fill="F8FAFC"/>
             <w:tcMar>
-              <w:top w:w="50" w:type="dxa"/>
-              <w:bottom w:w="50" w:type="dxa"/>
+              <w:top w:w="60" w:type="dxa"/>
+              <w:bottom w:w="60" w:type="dxa"/>
               <w:left w:w="80" w:type="dxa"/>
               <w:right w:w="80" w:type="dxa"/>
             </w:tcMar>
@@ -1785,11 +2272,11 @@
         </w:tc>
         <w:tc>
           <w:tcPr>
-            <w:tcW w:type="dxa" w:w="4752"/>
+            <w:tcW w:type="dxa" w:w="3216"/>
             <w:shd w:fill="F8FAFC"/>
             <w:tcMar>
-              <w:top w:w="50" w:type="dxa"/>
-              <w:bottom w:w="50" w:type="dxa"/>
+              <w:top w:w="60" w:type="dxa"/>
+              <w:bottom w:w="60" w:type="dxa"/>
               <w:left w:w="80" w:type="dxa"/>
               <w:right w:w="80" w:type="dxa"/>
             </w:tcMar>
@@ -1799,17 +2286,17 @@
               <w:rPr>
                 <w:sz w:val="17"/>
               </w:rPr>
-              <w:t>Enviar paquete documental de alta de clientes: CSF muestra, Carta de fleteras y seguro</w:t>
+              <w:t>Enviar paquete documental de clientes: CSF muestra, Carta de fleteras</w:t>
             </w:r>
           </w:p>
         </w:tc>
         <w:tc>
           <w:tcPr>
-            <w:tcW w:type="dxa" w:w="2016"/>
+            <w:tcW w:type="dxa" w:w="3216"/>
             <w:shd w:fill="F8FAFC"/>
             <w:tcMar>
-              <w:top w:w="50" w:type="dxa"/>
-              <w:bottom w:w="50" w:type="dxa"/>
+              <w:top w:w="60" w:type="dxa"/>
+              <w:bottom w:w="60" w:type="dxa"/>
               <w:left w:w="80" w:type="dxa"/>
               <w:right w:w="80" w:type="dxa"/>
             </w:tcMar>
@@ -1819,7 +2306,7 @@
               <w:rPr>
                 <w:sz w:val="17"/>
               </w:rPr>
-              <w:t>Semana 42 (Oct 2026) — Pendiente envío</w:t>
+              <w:t>Pendiente envío</w:t>
             </w:r>
           </w:p>
         </w:tc>
@@ -1827,11 +2314,11 @@
       <w:tr>
         <w:tc>
           <w:tcPr>
-            <w:tcW w:type="dxa" w:w="2880"/>
+            <w:tcW w:type="dxa" w:w="3216"/>
             <w:shd w:fill="FFFFFF"/>
             <w:tcMar>
-              <w:top w:w="50" w:type="dxa"/>
-              <w:bottom w:w="50" w:type="dxa"/>
+              <w:top w:w="60" w:type="dxa"/>
+              <w:bottom w:w="60" w:type="dxa"/>
               <w:left w:w="80" w:type="dxa"/>
               <w:right w:w="80" w:type="dxa"/>
             </w:tcMar>
@@ -1842,17 +2329,17 @@
                 <w:b/>
                 <w:sz w:val="17"/>
               </w:rPr>
-              <w:t>Movida TCI (Jonathan/Ricardo)</w:t>
+              <w:t>Formatex / Carla</w:t>
             </w:r>
           </w:p>
         </w:tc>
         <w:tc>
           <w:tcPr>
-            <w:tcW w:type="dxa" w:w="4752"/>
+            <w:tcW w:type="dxa" w:w="3216"/>
             <w:shd w:fill="FFFFFF"/>
             <w:tcMar>
-              <w:top w:w="50" w:type="dxa"/>
-              <w:bottom w:w="50" w:type="dxa"/>
+              <w:top w:w="60" w:type="dxa"/>
+              <w:bottom w:w="60" w:type="dxa"/>
               <w:left w:w="80" w:type="dxa"/>
               <w:right w:w="80" w:type="dxa"/>
             </w:tcMar>
@@ -1862,17 +2349,17 @@
               <w:rPr>
                 <w:sz w:val="17"/>
               </w:rPr>
-              <w:t>Presentación del documento de reglas de negocio y modelo de cotización integrado</w:t>
+              <w:t>Sesión de levantamiento de Embarques y plataforma Drive In</w:t>
             </w:r>
           </w:p>
         </w:tc>
         <w:tc>
           <w:tcPr>
-            <w:tcW w:type="dxa" w:w="2016"/>
+            <w:tcW w:type="dxa" w:w="3216"/>
             <w:shd w:fill="FFFFFF"/>
             <w:tcMar>
-              <w:top w:w="50" w:type="dxa"/>
-              <w:bottom w:w="50" w:type="dxa"/>
+              <w:top w:w="60" w:type="dxa"/>
+              <w:bottom w:w="60" w:type="dxa"/>
               <w:left w:w="80" w:type="dxa"/>
               <w:right w:w="80" w:type="dxa"/>
             </w:tcMar>
@@ -1882,7 +2369,7 @@
               <w:rPr>
                 <w:sz w:val="17"/>
               </w:rPr>
-              <w:t>Completado (14 Oct 2026)</w:t>
+              <w:t>Programada para semana siguiente</w:t>
             </w:r>
           </w:p>
         </w:tc>
@@ -1890,11 +2377,11 @@
       <w:tr>
         <w:tc>
           <w:tcPr>
-            <w:tcW w:type="dxa" w:w="2880"/>
+            <w:tcW w:type="dxa" w:w="3216"/>
             <w:shd w:fill="F8FAFC"/>
             <w:tcMar>
-              <w:top w:w="50" w:type="dxa"/>
-              <w:bottom w:w="50" w:type="dxa"/>
+              <w:top w:w="60" w:type="dxa"/>
+              <w:bottom w:w="60" w:type="dxa"/>
               <w:left w:w="80" w:type="dxa"/>
               <w:right w:w="80" w:type="dxa"/>
             </w:tcMar>
@@ -1905,17 +2392,17 @@
                 <w:b/>
                 <w:sz w:val="17"/>
               </w:rPr>
-              <w:t>Movida TCI &amp; Marketing</w:t>
+              <w:t>Formatex / Israel</w:t>
             </w:r>
           </w:p>
         </w:tc>
         <w:tc>
           <w:tcPr>
-            <w:tcW w:type="dxa" w:w="4752"/>
+            <w:tcW w:type="dxa" w:w="3216"/>
             <w:shd w:fill="F8FAFC"/>
             <w:tcMar>
-              <w:top w:w="50" w:type="dxa"/>
-              <w:bottom w:w="50" w:type="dxa"/>
+              <w:top w:w="60" w:type="dxa"/>
+              <w:bottom w:w="60" w:type="dxa"/>
               <w:left w:w="80" w:type="dxa"/>
               <w:right w:w="80" w:type="dxa"/>
             </w:tcMar>
@@ -1925,17 +2412,17 @@
               <w:rPr>
                 <w:sz w:val="17"/>
               </w:rPr>
-              <w:t>Agendar sesión especializada de levantamiento para el flujo de compras y pedidos Web</w:t>
+              <w:t>Sesiones de levantamiento de Almacén y recepción de Telares (1 y 2)</w:t>
             </w:r>
           </w:p>
         </w:tc>
         <w:tc>
           <w:tcPr>
-            <w:tcW w:type="dxa" w:w="2016"/>
+            <w:tcW w:type="dxa" w:w="3216"/>
             <w:shd w:fill="F8FAFC"/>
             <w:tcMar>
-              <w:top w:w="50" w:type="dxa"/>
-              <w:bottom w:w="50" w:type="dxa"/>
+              <w:top w:w="60" w:type="dxa"/>
+              <w:bottom w:w="60" w:type="dxa"/>
               <w:left w:w="80" w:type="dxa"/>
               <w:right w:w="80" w:type="dxa"/>
             </w:tcMar>
@@ -1945,7 +2432,200 @@
               <w:rPr>
                 <w:sz w:val="17"/>
               </w:rPr>
-              <w:t>Por agendar con Gerente de Marketing</w:t>
+              <w:t>Programada Viernes 23 de Octubre</w:t>
+            </w:r>
+          </w:p>
+        </w:tc>
+      </w:tr>
+      <w:tr>
+        <w:tc>
+          <w:tcPr>
+            <w:tcW w:type="dxa" w:w="3216"/>
+            <w:shd w:fill="FFFFFF"/>
+            <w:tcMar>
+              <w:top w:w="60" w:type="dxa"/>
+              <w:bottom w:w="60" w:type="dxa"/>
+              <w:left w:w="80" w:type="dxa"/>
+              <w:right w:w="80" w:type="dxa"/>
+            </w:tcMar>
+          </w:tcPr>
+          <w:p>
+            <w:r>
+              <w:rPr>
+                <w:b/>
+                <w:sz w:val="17"/>
+              </w:rPr>
+              <w:t>Formatex / Nayeli</w:t>
+            </w:r>
+          </w:p>
+        </w:tc>
+        <w:tc>
+          <w:tcPr>
+            <w:tcW w:type="dxa" w:w="3216"/>
+            <w:shd w:fill="FFFFFF"/>
+            <w:tcMar>
+              <w:top w:w="60" w:type="dxa"/>
+              <w:bottom w:w="60" w:type="dxa"/>
+              <w:left w:w="80" w:type="dxa"/>
+              <w:right w:w="80" w:type="dxa"/>
+            </w:tcMar>
+          </w:tcPr>
+          <w:p>
+            <w:r>
+              <w:rPr>
+                <w:sz w:val="17"/>
+              </w:rPr>
+              <w:t>Validación de variantes Shopify y envíos internacionales</w:t>
+            </w:r>
+          </w:p>
+        </w:tc>
+        <w:tc>
+          <w:tcPr>
+            <w:tcW w:type="dxa" w:w="3216"/>
+            <w:shd w:fill="FFFFFF"/>
+            <w:tcMar>
+              <w:top w:w="60" w:type="dxa"/>
+              <w:bottom w:w="60" w:type="dxa"/>
+              <w:left w:w="80" w:type="dxa"/>
+              <w:right w:w="80" w:type="dxa"/>
+            </w:tcMar>
+          </w:tcPr>
+          <w:p>
+            <w:r>
+              <w:rPr>
+                <w:sz w:val="17"/>
+              </w:rPr>
+              <w:t>Por agendar breve llamada</w:t>
+            </w:r>
+          </w:p>
+        </w:tc>
+      </w:tr>
+      <w:tr>
+        <w:tc>
+          <w:tcPr>
+            <w:tcW w:type="dxa" w:w="3216"/>
+            <w:shd w:fill="F8FAFC"/>
+            <w:tcMar>
+              <w:top w:w="60" w:type="dxa"/>
+              <w:bottom w:w="60" w:type="dxa"/>
+              <w:left w:w="80" w:type="dxa"/>
+              <w:right w:w="80" w:type="dxa"/>
+            </w:tcMar>
+          </w:tcPr>
+          <w:p>
+            <w:r>
+              <w:rPr>
+                <w:b/>
+                <w:sz w:val="17"/>
+              </w:rPr>
+              <w:t>Movida TCI</w:t>
+            </w:r>
+          </w:p>
+        </w:tc>
+        <w:tc>
+          <w:tcPr>
+            <w:tcW w:type="dxa" w:w="3216"/>
+            <w:shd w:fill="F8FAFC"/>
+            <w:tcMar>
+              <w:top w:w="60" w:type="dxa"/>
+              <w:bottom w:w="60" w:type="dxa"/>
+              <w:left w:w="80" w:type="dxa"/>
+              <w:right w:w="80" w:type="dxa"/>
+            </w:tcMar>
+          </w:tcPr>
+          <w:p>
+            <w:r>
+              <w:rPr>
+                <w:sz w:val="17"/>
+              </w:rPr>
+              <w:t>Entrega de documento oficial v1.1 consolidado con Sesión #2 para firma</w:t>
+            </w:r>
+          </w:p>
+        </w:tc>
+        <w:tc>
+          <w:tcPr>
+            <w:tcW w:type="dxa" w:w="3216"/>
+            <w:shd w:fill="DCFCE7"/>
+            <w:tcMar>
+              <w:top w:w="60" w:type="dxa"/>
+              <w:bottom w:w="60" w:type="dxa"/>
+              <w:left w:w="80" w:type="dxa"/>
+              <w:right w:w="80" w:type="dxa"/>
+            </w:tcMar>
+          </w:tcPr>
+          <w:p>
+            <w:r>
+              <w:rPr>
+                <w:b/>
+                <w:color w:val="166534"/>
+                <w:sz w:val="17"/>
+              </w:rPr>
+              <w:t>COMPLETADO</w:t>
+            </w:r>
+          </w:p>
+        </w:tc>
+      </w:tr>
+      <w:tr>
+        <w:tc>
+          <w:tcPr>
+            <w:tcW w:type="dxa" w:w="3216"/>
+            <w:shd w:fill="FFFFFF"/>
+            <w:tcMar>
+              <w:top w:w="60" w:type="dxa"/>
+              <w:bottom w:w="60" w:type="dxa"/>
+              <w:left w:w="80" w:type="dxa"/>
+              <w:right w:w="80" w:type="dxa"/>
+            </w:tcMar>
+          </w:tcPr>
+          <w:p>
+            <w:r>
+              <w:rPr>
+                <w:b/>
+                <w:sz w:val="17"/>
+              </w:rPr>
+              <w:t>Movida TCI</w:t>
+            </w:r>
+          </w:p>
+        </w:tc>
+        <w:tc>
+          <w:tcPr>
+            <w:tcW w:type="dxa" w:w="3216"/>
+            <w:shd w:fill="FFFFFF"/>
+            <w:tcMar>
+              <w:top w:w="60" w:type="dxa"/>
+              <w:bottom w:w="60" w:type="dxa"/>
+              <w:left w:w="80" w:type="dxa"/>
+              <w:right w:w="80" w:type="dxa"/>
+            </w:tcMar>
+          </w:tcPr>
+          <w:p>
+            <w:r>
+              <w:rPr>
+                <w:sz w:val="17"/>
+              </w:rPr>
+              <w:t>Implementación de selector de días de ruta, bloqueo de precios y muestras</w:t>
+            </w:r>
+          </w:p>
+        </w:tc>
+        <w:tc>
+          <w:tcPr>
+            <w:tcW w:type="dxa" w:w="3216"/>
+            <w:shd w:fill="DCFCE7"/>
+            <w:tcMar>
+              <w:top w:w="60" w:type="dxa"/>
+              <w:bottom w:w="60" w:type="dxa"/>
+              <w:left w:w="80" w:type="dxa"/>
+              <w:right w:w="80" w:type="dxa"/>
+            </w:tcMar>
+          </w:tcPr>
+          <w:p>
+            <w:r>
+              <w:rPr>
+                <w:b/>
+                <w:color w:val="166534"/>
+                <w:sz w:val="17"/>
+              </w:rPr>
+              <w:t>COMPLETADO en frontend v1.4.1</w:t>
             </w:r>
           </w:p>
         </w:tc>
@@ -1953,24 +2633,21 @@
     </w:tbl>
     <w:p>
       <w:pPr>
-        <w:spacing w:after="280"/>
-      </w:pPr>
-    </w:p>
-    <w:p>
-      <w:pPr>
-        <w:pStyle w:val="Heading1"/>
-        <w:spacing w:before="320"/>
+        <w:keepNext/>
+        <w:spacing w:before="320" w:after="120"/>
       </w:pPr>
       <w:r>
         <w:rPr>
-          <w:color w:val="1E293B"/>
+          <w:b/>
+          <w:color w:val="3730A3"/>
+          <w:sz w:val="28"/>
         </w:rPr>
-        <w:t>10. Formalización y Firmas de Conformidad</w:t>
+        <w:t>9. Formalización y Firmas de Conformidad</w:t>
       </w:r>
     </w:p>
     <w:p>
       <w:r>
-        <w:t>Al firmar el presente documento, las partes manifiestan su conformidad con los requerimientos, candados de seguridad y reglas operativas aquí descritas, reconociéndolas como el estándar oficial bajo el cual se valida el módulo de Atención al Cliente (ATC) del WMS 360+ Formatex:</w:t>
+        <w:t>Al firmar el presente documento, las partes manifiestan su plena conformidad con los requerimientos, candados de seguridad operativa y reglas de negocio aquí descritas, reconociéndolas como el marco oficial y vinculante de desarrollo y aceptación para el módulo de Atención al Cliente (ATC), Ventas y Conexión Logística del WMS 360+ Formatex:</w:t>
       </w:r>
     </w:p>
     <w:p>
@@ -1994,30 +2671,43 @@
           <w:tcPr>
             <w:tcW w:type="dxa" w:w="4752"/>
             <w:tcMar>
-              <w:top w:w="120" w:type="dxa"/>
-              <w:bottom w:w="120" w:type="dxa"/>
+              <w:top w:w="100" w:type="dxa"/>
+              <w:bottom w:w="100" w:type="dxa"/>
               <w:left w:w="80" w:type="dxa"/>
               <w:right w:w="80" w:type="dxa"/>
             </w:tcMar>
           </w:tcPr>
           <w:p>
             <w:pPr>
+              <w:spacing w:after="40"/>
               <w:jc w:val="center"/>
             </w:pPr>
             <w:r>
               <w:rPr>
-                <w:color w:val="334155"/>
-                <w:sz w:val="18"/>
+                <w:b/>
               </w:rPr>
               <w:t>_________________________________________</w:t>
               <w:br/>
+            </w:r>
+            <w:r>
+              <w:rPr>
+                <w:b/>
+                <w:color w:val="0F172A"/>
+                <w:sz w:val="20"/>
+              </w:rPr>
               <w:t>Alma</w:t>
               <w:br/>
+            </w:r>
+            <w:r>
+              <w:rPr>
+                <w:color w:val="64748B"/>
+                <w:sz w:val="17"/>
+              </w:rPr>
               <w:t>Jefatura de Atención al Cliente</w:t>
               <w:br/>
               <w:t>Forma Textil S. de R.L. de C.V.</w:t>
               <w:br/>
-              <w:t>Fecha: ____ / ____ / 2026</w:t>
+              <w:t>Fecha: _____ / _____ / 2026</w:t>
             </w:r>
           </w:p>
         </w:tc>
@@ -2025,30 +2715,43 @@
           <w:tcPr>
             <w:tcW w:type="dxa" w:w="4752"/>
             <w:tcMar>
-              <w:top w:w="120" w:type="dxa"/>
-              <w:bottom w:w="120" w:type="dxa"/>
+              <w:top w:w="100" w:type="dxa"/>
+              <w:bottom w:w="100" w:type="dxa"/>
               <w:left w:w="80" w:type="dxa"/>
               <w:right w:w="80" w:type="dxa"/>
             </w:tcMar>
           </w:tcPr>
           <w:p>
             <w:pPr>
+              <w:spacing w:after="40"/>
               <w:jc w:val="center"/>
             </w:pPr>
             <w:r>
               <w:rPr>
-                <w:color w:val="334155"/>
-                <w:sz w:val="18"/>
+                <w:b/>
               </w:rPr>
               <w:t>_________________________________________</w:t>
               <w:br/>
+            </w:r>
+            <w:r>
+              <w:rPr>
+                <w:b/>
+                <w:color w:val="0F172A"/>
+                <w:sz w:val="20"/>
+              </w:rPr>
               <w:t>Andrea Ramírez</w:t>
               <w:br/>
+            </w:r>
+            <w:r>
+              <w:rPr>
+                <w:color w:val="64748B"/>
+                <w:sz w:val="17"/>
+              </w:rPr>
               <w:t>Atención al Cliente &amp; Operaciones</w:t>
               <w:br/>
               <w:t>Forma Textil S. de R.L. de C.V.</w:t>
               <w:br/>
-              <w:t>Fecha: ____ / ____ / 2026</w:t>
+              <w:t>Fecha: _____ / _____ / 2026</w:t>
             </w:r>
           </w:p>
         </w:tc>
@@ -2058,30 +2761,43 @@
           <w:tcPr>
             <w:tcW w:type="dxa" w:w="4752"/>
             <w:tcMar>
-              <w:top w:w="120" w:type="dxa"/>
-              <w:bottom w:w="120" w:type="dxa"/>
+              <w:top w:w="100" w:type="dxa"/>
+              <w:bottom w:w="100" w:type="dxa"/>
               <w:left w:w="80" w:type="dxa"/>
               <w:right w:w="80" w:type="dxa"/>
             </w:tcMar>
           </w:tcPr>
           <w:p>
             <w:pPr>
+              <w:spacing w:after="40"/>
               <w:jc w:val="center"/>
             </w:pPr>
             <w:r>
               <w:rPr>
-                <w:color w:val="334155"/>
-                <w:sz w:val="18"/>
+                <w:b/>
               </w:rPr>
               <w:t>_________________________________________</w:t>
               <w:br/>
+            </w:r>
+            <w:r>
+              <w:rPr>
+                <w:b/>
+                <w:color w:val="0F172A"/>
+                <w:sz w:val="20"/>
+              </w:rPr>
               <w:t>Ricardo Zerpa</w:t>
               <w:br/>
+            </w:r>
+            <w:r>
+              <w:rPr>
+                <w:color w:val="64748B"/>
+                <w:sz w:val="17"/>
+              </w:rPr>
               <w:t>Arquitectura de Producto &amp; Procesos</w:t>
               <w:br/>
               <w:t>Movida TCI LLC</w:t>
               <w:br/>
-              <w:t>Fecha: ____ / ____ / 2026</w:t>
+              <w:t>Fecha: _____ / _____ / 2026</w:t>
             </w:r>
           </w:p>
         </w:tc>
@@ -2089,30 +2805,43 @@
           <w:tcPr>
             <w:tcW w:type="dxa" w:w="4752"/>
             <w:tcMar>
-              <w:top w:w="120" w:type="dxa"/>
-              <w:bottom w:w="120" w:type="dxa"/>
+              <w:top w:w="100" w:type="dxa"/>
+              <w:bottom w:w="100" w:type="dxa"/>
               <w:left w:w="80" w:type="dxa"/>
               <w:right w:w="80" w:type="dxa"/>
             </w:tcMar>
           </w:tcPr>
           <w:p>
             <w:pPr>
+              <w:spacing w:after="40"/>
               <w:jc w:val="center"/>
             </w:pPr>
             <w:r>
               <w:rPr>
-                <w:color w:val="334155"/>
-                <w:sz w:val="18"/>
+                <w:b/>
               </w:rPr>
               <w:t>_________________________________________</w:t>
               <w:br/>
+            </w:r>
+            <w:r>
+              <w:rPr>
+                <w:b/>
+                <w:color w:val="0F172A"/>
+                <w:sz w:val="20"/>
+              </w:rPr>
               <w:t>Jonathan Palacios</w:t>
               <w:br/>
+            </w:r>
+            <w:r>
+              <w:rPr>
+                <w:color w:val="64748B"/>
+                <w:sz w:val="17"/>
+              </w:rPr>
               <w:t>Dirección Técnica &amp; Desarrollo WMS</w:t>
               <w:br/>
               <w:t>Movida TCI LLC</w:t>
               <w:br/>
-              <w:t>Fecha: ____ / ____ / 2026</w:t>
+              <w:t>Fecha: _____ / _____ / 2026</w:t>
             </w:r>
           </w:p>
         </w:tc>
@@ -2120,7 +2849,7 @@
     </w:tbl>
     <w:sectPr>
       <w:pgSz w:w="12240" w:h="15840"/>
-      <w:pgMar w:top="1296" w:right="1296" w:bottom="1296" w:left="1296" w:header="720" w:footer="720" w:gutter="0"/>
+      <w:pgMar w:top="1152" w:right="1296" w:bottom="1152" w:left="1296" w:header="720" w:footer="720" w:gutter="0"/>
       <w:cols w:space="720"/>
       <w:docGrid w:linePitch="360"/>
     </w:sectPr>
@@ -2493,7 +3222,7 @@
     <w:rsid w:val="00FC693F"/>
     <w:rPr>
       <w:rFonts w:ascii="Calibri" w:hAnsi="Calibri"/>
-      <w:color w:val="1F2937"/>
+      <w:color w:val="334155"/>
       <w:sz w:val="21"/>
     </w:rPr>
   </w:style>

</xml_diff>